<commit_message>
Sec OPD 3 done
</commit_message>
<xml_diff>
--- a/Sec-Week-3/C security practicum 3.docx
+++ b/Sec-Week-3/C security practicum 3.docx
@@ -112,7 +112,159 @@
       </w:r>
       <w:r>
         <w:t xml:space="preserve">.</w:t>
+        <w:br/>
       </w:r>
+      <w:r>
+        <mc:AlternateContent>
+          <mc:Choice Requires="wpg">
+            <w:drawing>
+              <wp:inline xmlns:wp="http://schemas.openxmlformats.org/drawingml/2006/wordprocessingDrawing" distT="0" distB="0" distL="0" distR="0">
+                <wp:extent cx="5731510" cy="1126266"/>
+                <wp:effectExtent l="0" t="0" r="0" b="0"/>
+                <wp:docPr id="1" name=""/>
+                <wp:cNvGraphicFramePr>
+                  <a:graphicFrameLocks xmlns:a="http://schemas.openxmlformats.org/drawingml/2006/main" noChangeAspect="1"/>
+                </wp:cNvGraphicFramePr>
+                <a:graphic xmlns:a="http://schemas.openxmlformats.org/drawingml/2006/main">
+                  <a:graphicData uri="http://schemas.openxmlformats.org/drawingml/2006/picture">
+                    <pic:pic xmlns:pic="http://schemas.openxmlformats.org/drawingml/2006/picture">
+                      <pic:nvPicPr>
+                        <pic:cNvPr id="1107642325" name=""/>
+                        <pic:cNvPicPr>
+                          <a:picLocks noChangeAspect="1"/>
+                        </pic:cNvPicPr>
+                        <pic:nvPr/>
+                      </pic:nvPicPr>
+                      <pic:blipFill>
+                        <a:blip r:embed="rId10"/>
+                        <a:stretch/>
+                      </pic:blipFill>
+                      <pic:spPr bwMode="auto">
+                        <a:xfrm>
+                          <a:off x="0" y="0"/>
+                          <a:ext cx="5731509" cy="1126265"/>
+                        </a:xfrm>
+                        <a:prstGeom prst="rect">
+                          <a:avLst/>
+                        </a:prstGeom>
+                      </pic:spPr>
+                    </pic:pic>
+                  </a:graphicData>
+                </a:graphic>
+              </wp:inline>
+            </w:drawing>
+          </mc:Choice>
+          <mc:Fallback>
+            <w:pict>
+              <v:shapetype id="_x0000_t75" coordsize="21600,21600" o:spt="75" o:preferrelative="t" path="m@4@5l@4@11@9@11@9@5xe" filled="f" stroked="f">
+                <v:stroke joinstyle="miter"/>
+                <v:formulas>
+                  <v:f eqn="if lineDrawn pixelLineWidth 0"/>
+                  <v:f eqn="sum @0 1 0"/>
+                  <v:f eqn="sum 0 0 @1"/>
+                  <v:f eqn="prod @2 1 2"/>
+                  <v:f eqn="prod @3 21600 pixelWidth"/>
+                  <v:f eqn="prod @3 21600 pixelHeight"/>
+                  <v:f eqn="sum @0 0 1"/>
+                  <v:f eqn="prod @6 1 2"/>
+                  <v:f eqn="prod @7 21600 pixelWidth"/>
+                  <v:f eqn="sum @8 21600 0"/>
+                  <v:f eqn="prod @7 21600 pixelHeight"/>
+                  <v:f eqn="sum @10 21600 0"/>
+                </v:formulas>
+                <v:path o:extrusionok="f" gradientshapeok="t" o:connecttype="rect"/>
+                <o:lock v:ext="edit" aspectratio="t"/>
+              </v:shapetype>
+              <v:shape id="_x0000_i0" o:spid="_x0000_s0" type="#_x0000_t75" style="width:451.30pt;height:88.68pt;mso-wrap-distance-left:0.00pt;mso-wrap-distance-top:0.00pt;mso-wrap-distance-right:0.00pt;mso-wrap-distance-bottom:0.00pt;z-index:1;" stroked="false">
+                <v:imagedata r:id="rId10" o:title=""/>
+                <o:lock v:ext="edit" rotation="t"/>
+              </v:shape>
+            </w:pict>
+          </mc:Fallback>
+        </mc:AlternateContent>
+      </w:r>
+      <w:r/>
+    </w:p>
+    <w:p>
+      <w:pPr>
+        <w:pBdr/>
+        <w:spacing/>
+        <w:ind w:firstLine="0" w:left="720"/>
+        <w:rPr/>
+      </w:pPr>
+      <w:r>
+        <w:br/>
+      </w:r>
+      <w:r>
+        <mc:AlternateContent>
+          <mc:Choice Requires="wpg">
+            <w:drawing>
+              <wp:inline xmlns:wp="http://schemas.openxmlformats.org/drawingml/2006/wordprocessingDrawing" distT="0" distB="0" distL="0" distR="0">
+                <wp:extent cx="4905375" cy="781050"/>
+                <wp:effectExtent l="0" t="0" r="0" b="0"/>
+                <wp:docPr id="2" name=""/>
+                <wp:cNvGraphicFramePr>
+                  <a:graphicFrameLocks xmlns:a="http://schemas.openxmlformats.org/drawingml/2006/main" noChangeAspect="1"/>
+                </wp:cNvGraphicFramePr>
+                <a:graphic xmlns:a="http://schemas.openxmlformats.org/drawingml/2006/main">
+                  <a:graphicData uri="http://schemas.openxmlformats.org/drawingml/2006/picture">
+                    <pic:pic xmlns:pic="http://schemas.openxmlformats.org/drawingml/2006/picture">
+                      <pic:nvPicPr>
+                        <pic:cNvPr id="1855919842" name=""/>
+                        <pic:cNvPicPr>
+                          <a:picLocks noChangeAspect="1"/>
+                        </pic:cNvPicPr>
+                        <pic:nvPr/>
+                      </pic:nvPicPr>
+                      <pic:blipFill>
+                        <a:blip r:embed="rId11"/>
+                        <a:stretch/>
+                      </pic:blipFill>
+                      <pic:spPr bwMode="auto">
+                        <a:xfrm>
+                          <a:off x="0" y="0"/>
+                          <a:ext cx="4905374" cy="781049"/>
+                        </a:xfrm>
+                        <a:prstGeom prst="rect">
+                          <a:avLst/>
+                        </a:prstGeom>
+                      </pic:spPr>
+                    </pic:pic>
+                  </a:graphicData>
+                </a:graphic>
+              </wp:inline>
+            </w:drawing>
+          </mc:Choice>
+          <mc:Fallback>
+            <w:pict>
+              <v:shapetype id="_x0000_t75" coordsize="21600,21600" o:spt="75" o:preferrelative="t" path="m@4@5l@4@11@9@11@9@5xe" filled="f" stroked="f">
+                <v:stroke joinstyle="miter"/>
+                <v:formulas>
+                  <v:f eqn="if lineDrawn pixelLineWidth 0"/>
+                  <v:f eqn="sum @0 1 0"/>
+                  <v:f eqn="sum 0 0 @1"/>
+                  <v:f eqn="prod @2 1 2"/>
+                  <v:f eqn="prod @3 21600 pixelWidth"/>
+                  <v:f eqn="prod @3 21600 pixelHeight"/>
+                  <v:f eqn="sum @0 0 1"/>
+                  <v:f eqn="prod @6 1 2"/>
+                  <v:f eqn="prod @7 21600 pixelWidth"/>
+                  <v:f eqn="sum @8 21600 0"/>
+                  <v:f eqn="prod @7 21600 pixelHeight"/>
+                  <v:f eqn="sum @10 21600 0"/>
+                </v:formulas>
+                <v:path o:extrusionok="f" gradientshapeok="t" o:connecttype="rect"/>
+                <o:lock v:ext="edit" aspectratio="t"/>
+              </v:shapetype>
+              <v:shape id="_x0000_i1" o:spid="_x0000_s1" type="#_x0000_t75" style="width:386.25pt;height:61.50pt;mso-wrap-distance-left:0.00pt;mso-wrap-distance-top:0.00pt;mso-wrap-distance-right:0.00pt;mso-wrap-distance-bottom:0.00pt;z-index:1;" stroked="false">
+                <v:imagedata r:id="rId11" o:title=""/>
+                <o:lock v:ext="edit" rotation="t"/>
+              </v:shape>
+            </w:pict>
+          </mc:Fallback>
+        </mc:AlternateContent>
+      </w:r>
+      <w:r/>
       <w:r/>
     </w:p>
     <w:p>
@@ -165,7 +317,160 @@
       </w:r>
       <w:r>
         <w:t xml:space="preserve"> 2.7</w:t>
+        <w:br/>
       </w:r>
+      <w:r>
+        <mc:AlternateContent>
+          <mc:Choice Requires="wpg">
+            <w:drawing>
+              <wp:inline xmlns:wp="http://schemas.openxmlformats.org/drawingml/2006/wordprocessingDrawing" distT="0" distB="0" distL="0" distR="0">
+                <wp:extent cx="5731510" cy="2594441"/>
+                <wp:effectExtent l="0" t="0" r="0" b="0"/>
+                <wp:docPr id="3" name=""/>
+                <wp:cNvGraphicFramePr>
+                  <a:graphicFrameLocks xmlns:a="http://schemas.openxmlformats.org/drawingml/2006/main" noChangeAspect="1"/>
+                </wp:cNvGraphicFramePr>
+                <a:graphic xmlns:a="http://schemas.openxmlformats.org/drawingml/2006/main">
+                  <a:graphicData uri="http://schemas.openxmlformats.org/drawingml/2006/picture">
+                    <pic:pic xmlns:pic="http://schemas.openxmlformats.org/drawingml/2006/picture">
+                      <pic:nvPicPr>
+                        <pic:cNvPr id="844998777" name=""/>
+                        <pic:cNvPicPr>
+                          <a:picLocks noChangeAspect="1"/>
+                        </pic:cNvPicPr>
+                        <pic:nvPr/>
+                      </pic:nvPicPr>
+                      <pic:blipFill>
+                        <a:blip r:embed="rId12"/>
+                        <a:stretch/>
+                      </pic:blipFill>
+                      <pic:spPr bwMode="auto">
+                        <a:xfrm>
+                          <a:off x="0" y="0"/>
+                          <a:ext cx="5731509" cy="2594440"/>
+                        </a:xfrm>
+                        <a:prstGeom prst="rect">
+                          <a:avLst/>
+                        </a:prstGeom>
+                      </pic:spPr>
+                    </pic:pic>
+                  </a:graphicData>
+                </a:graphic>
+              </wp:inline>
+            </w:drawing>
+          </mc:Choice>
+          <mc:Fallback>
+            <w:pict>
+              <v:shapetype id="_x0000_t75" coordsize="21600,21600" o:spt="75" o:preferrelative="t" path="m@4@5l@4@11@9@11@9@5xe" filled="f" stroked="f">
+                <v:stroke joinstyle="miter"/>
+                <v:formulas>
+                  <v:f eqn="if lineDrawn pixelLineWidth 0"/>
+                  <v:f eqn="sum @0 1 0"/>
+                  <v:f eqn="sum 0 0 @1"/>
+                  <v:f eqn="prod @2 1 2"/>
+                  <v:f eqn="prod @3 21600 pixelWidth"/>
+                  <v:f eqn="prod @3 21600 pixelHeight"/>
+                  <v:f eqn="sum @0 0 1"/>
+                  <v:f eqn="prod @6 1 2"/>
+                  <v:f eqn="prod @7 21600 pixelWidth"/>
+                  <v:f eqn="sum @8 21600 0"/>
+                  <v:f eqn="prod @7 21600 pixelHeight"/>
+                  <v:f eqn="sum @10 21600 0"/>
+                </v:formulas>
+                <v:path o:extrusionok="f" gradientshapeok="t" o:connecttype="rect"/>
+                <o:lock v:ext="edit" aspectratio="t"/>
+              </v:shapetype>
+              <v:shape id="_x0000_i2" o:spid="_x0000_s2" type="#_x0000_t75" style="width:451.30pt;height:204.29pt;mso-wrap-distance-left:0.00pt;mso-wrap-distance-top:0.00pt;mso-wrap-distance-right:0.00pt;mso-wrap-distance-bottom:0.00pt;z-index:1;" stroked="false">
+                <v:imagedata r:id="rId12" o:title=""/>
+                <o:lock v:ext="edit" rotation="t"/>
+              </v:shape>
+            </w:pict>
+          </mc:Fallback>
+        </mc:AlternateContent>
+      </w:r>
+      <w:r/>
+      <w:r/>
+    </w:p>
+    <w:p>
+      <w:pPr>
+        <w:pBdr/>
+        <w:spacing/>
+        <w:ind w:firstLine="0" w:left="720"/>
+        <w:rPr/>
+      </w:pPr>
+      <w:r>
+        <w:br/>
+      </w:r>
+      <w:r>
+        <mc:AlternateContent>
+          <mc:Choice Requires="wpg">
+            <w:drawing>
+              <wp:inline xmlns:wp="http://schemas.openxmlformats.org/drawingml/2006/wordprocessingDrawing" distT="0" distB="0" distL="0" distR="0">
+                <wp:extent cx="5581650" cy="657225"/>
+                <wp:effectExtent l="0" t="0" r="0" b="0"/>
+                <wp:docPr id="4" name=""/>
+                <wp:cNvGraphicFramePr>
+                  <a:graphicFrameLocks xmlns:a="http://schemas.openxmlformats.org/drawingml/2006/main" noChangeAspect="1"/>
+                </wp:cNvGraphicFramePr>
+                <a:graphic xmlns:a="http://schemas.openxmlformats.org/drawingml/2006/main">
+                  <a:graphicData uri="http://schemas.openxmlformats.org/drawingml/2006/picture">
+                    <pic:pic xmlns:pic="http://schemas.openxmlformats.org/drawingml/2006/picture">
+                      <pic:nvPicPr>
+                        <pic:cNvPr id="1829532891" name=""/>
+                        <pic:cNvPicPr>
+                          <a:picLocks noChangeAspect="1"/>
+                        </pic:cNvPicPr>
+                        <pic:nvPr/>
+                      </pic:nvPicPr>
+                      <pic:blipFill>
+                        <a:blip r:embed="rId13"/>
+                        <a:stretch/>
+                      </pic:blipFill>
+                      <pic:spPr bwMode="auto">
+                        <a:xfrm>
+                          <a:off x="0" y="0"/>
+                          <a:ext cx="5581649" cy="657225"/>
+                        </a:xfrm>
+                        <a:prstGeom prst="rect">
+                          <a:avLst/>
+                        </a:prstGeom>
+                      </pic:spPr>
+                    </pic:pic>
+                  </a:graphicData>
+                </a:graphic>
+              </wp:inline>
+            </w:drawing>
+          </mc:Choice>
+          <mc:Fallback>
+            <w:pict>
+              <v:shapetype id="_x0000_t75" coordsize="21600,21600" o:spt="75" o:preferrelative="t" path="m@4@5l@4@11@9@11@9@5xe" filled="f" stroked="f">
+                <v:stroke joinstyle="miter"/>
+                <v:formulas>
+                  <v:f eqn="if lineDrawn pixelLineWidth 0"/>
+                  <v:f eqn="sum @0 1 0"/>
+                  <v:f eqn="sum 0 0 @1"/>
+                  <v:f eqn="prod @2 1 2"/>
+                  <v:f eqn="prod @3 21600 pixelWidth"/>
+                  <v:f eqn="prod @3 21600 pixelHeight"/>
+                  <v:f eqn="sum @0 0 1"/>
+                  <v:f eqn="prod @6 1 2"/>
+                  <v:f eqn="prod @7 21600 pixelWidth"/>
+                  <v:f eqn="sum @8 21600 0"/>
+                  <v:f eqn="prod @7 21600 pixelHeight"/>
+                  <v:f eqn="sum @10 21600 0"/>
+                </v:formulas>
+                <v:path o:extrusionok="f" gradientshapeok="t" o:connecttype="rect"/>
+                <o:lock v:ext="edit" aspectratio="t"/>
+              </v:shapetype>
+              <v:shape id="_x0000_i3" o:spid="_x0000_s3" type="#_x0000_t75" style="width:439.50pt;height:51.75pt;mso-wrap-distance-left:0.00pt;mso-wrap-distance-top:0.00pt;mso-wrap-distance-right:0.00pt;mso-wrap-distance-bottom:0.00pt;z-index:1;" stroked="false">
+                <v:imagedata r:id="rId13" o:title=""/>
+                <o:lock v:ext="edit" rotation="t"/>
+              </v:shape>
+            </w:pict>
+          </mc:Fallback>
+        </mc:AlternateContent>
+      </w:r>
+      <w:r/>
       <w:r/>
     </w:p>
     <w:p>
@@ -182,7 +487,151 @@
       </w:pPr>
       <w:r>
         <w:t xml:space="preserve">Demonstreer nu met een code voorbeeld een overflow. </w:t>
+        <w:br/>
       </w:r>
+      <w:r>
+        <mc:AlternateContent>
+          <mc:Choice Requires="wpg">
+            <w:drawing>
+              <wp:inline xmlns:wp="http://schemas.openxmlformats.org/drawingml/2006/wordprocessingDrawing" distT="0" distB="0" distL="0" distR="0">
+                <wp:extent cx="5731510" cy="1751535"/>
+                <wp:effectExtent l="0" t="0" r="0" b="0"/>
+                <wp:docPr id="5" name=""/>
+                <wp:cNvGraphicFramePr>
+                  <a:graphicFrameLocks xmlns:a="http://schemas.openxmlformats.org/drawingml/2006/main" noChangeAspect="1"/>
+                </wp:cNvGraphicFramePr>
+                <a:graphic xmlns:a="http://schemas.openxmlformats.org/drawingml/2006/main">
+                  <a:graphicData uri="http://schemas.openxmlformats.org/drawingml/2006/picture">
+                    <pic:pic xmlns:pic="http://schemas.openxmlformats.org/drawingml/2006/picture">
+                      <pic:nvPicPr>
+                        <pic:cNvPr id="1396343096" name=""/>
+                        <pic:cNvPicPr>
+                          <a:picLocks noChangeAspect="1"/>
+                        </pic:cNvPicPr>
+                        <pic:nvPr/>
+                      </pic:nvPicPr>
+                      <pic:blipFill>
+                        <a:blip r:embed="rId14"/>
+                        <a:stretch/>
+                      </pic:blipFill>
+                      <pic:spPr bwMode="auto">
+                        <a:xfrm>
+                          <a:off x="0" y="0"/>
+                          <a:ext cx="5731509" cy="1751535"/>
+                        </a:xfrm>
+                        <a:prstGeom prst="rect">
+                          <a:avLst/>
+                        </a:prstGeom>
+                      </pic:spPr>
+                    </pic:pic>
+                  </a:graphicData>
+                </a:graphic>
+              </wp:inline>
+            </w:drawing>
+          </mc:Choice>
+          <mc:Fallback>
+            <w:pict>
+              <v:shapetype id="_x0000_t75" coordsize="21600,21600" o:spt="75" o:preferrelative="t" path="m@4@5l@4@11@9@11@9@5xe" filled="f" stroked="f">
+                <v:stroke joinstyle="miter"/>
+                <v:formulas>
+                  <v:f eqn="if lineDrawn pixelLineWidth 0"/>
+                  <v:f eqn="sum @0 1 0"/>
+                  <v:f eqn="sum 0 0 @1"/>
+                  <v:f eqn="prod @2 1 2"/>
+                  <v:f eqn="prod @3 21600 pixelWidth"/>
+                  <v:f eqn="prod @3 21600 pixelHeight"/>
+                  <v:f eqn="sum @0 0 1"/>
+                  <v:f eqn="prod @6 1 2"/>
+                  <v:f eqn="prod @7 21600 pixelWidth"/>
+                  <v:f eqn="sum @8 21600 0"/>
+                  <v:f eqn="prod @7 21600 pixelHeight"/>
+                  <v:f eqn="sum @10 21600 0"/>
+                </v:formulas>
+                <v:path o:extrusionok="f" gradientshapeok="t" o:connecttype="rect"/>
+                <o:lock v:ext="edit" aspectratio="t"/>
+              </v:shapetype>
+              <v:shape id="_x0000_i4" o:spid="_x0000_s4" type="#_x0000_t75" style="width:451.30pt;height:137.92pt;mso-wrap-distance-left:0.00pt;mso-wrap-distance-top:0.00pt;mso-wrap-distance-right:0.00pt;mso-wrap-distance-bottom:0.00pt;z-index:1;" stroked="false">
+                <v:imagedata r:id="rId14" o:title=""/>
+                <o:lock v:ext="edit" rotation="t"/>
+              </v:shape>
+            </w:pict>
+          </mc:Fallback>
+        </mc:AlternateContent>
+      </w:r>
+      <w:r>
+        <w:br/>
+        <w:br/>
+      </w:r>
+      <w:r>
+        <mc:AlternateContent>
+          <mc:Choice Requires="wpg">
+            <w:drawing>
+              <wp:inline xmlns:wp="http://schemas.openxmlformats.org/drawingml/2006/wordprocessingDrawing" distT="0" distB="0" distL="0" distR="0">
+                <wp:extent cx="4552950" cy="695325"/>
+                <wp:effectExtent l="0" t="0" r="0" b="0"/>
+                <wp:docPr id="6" name=""/>
+                <wp:cNvGraphicFramePr>
+                  <a:graphicFrameLocks xmlns:a="http://schemas.openxmlformats.org/drawingml/2006/main" noChangeAspect="1"/>
+                </wp:cNvGraphicFramePr>
+                <a:graphic xmlns:a="http://schemas.openxmlformats.org/drawingml/2006/main">
+                  <a:graphicData uri="http://schemas.openxmlformats.org/drawingml/2006/picture">
+                    <pic:pic xmlns:pic="http://schemas.openxmlformats.org/drawingml/2006/picture">
+                      <pic:nvPicPr>
+                        <pic:cNvPr id="124716491" name=""/>
+                        <pic:cNvPicPr>
+                          <a:picLocks noChangeAspect="1"/>
+                        </pic:cNvPicPr>
+                        <pic:nvPr/>
+                      </pic:nvPicPr>
+                      <pic:blipFill>
+                        <a:blip r:embed="rId15"/>
+                        <a:stretch/>
+                      </pic:blipFill>
+                      <pic:spPr bwMode="auto">
+                        <a:xfrm>
+                          <a:off x="0" y="0"/>
+                          <a:ext cx="4552949" cy="695324"/>
+                        </a:xfrm>
+                        <a:prstGeom prst="rect">
+                          <a:avLst/>
+                        </a:prstGeom>
+                      </pic:spPr>
+                    </pic:pic>
+                  </a:graphicData>
+                </a:graphic>
+              </wp:inline>
+            </w:drawing>
+          </mc:Choice>
+          <mc:Fallback>
+            <w:pict>
+              <v:shapetype id="_x0000_t75" coordsize="21600,21600" o:spt="75" o:preferrelative="t" path="m@4@5l@4@11@9@11@9@5xe" filled="f" stroked="f">
+                <v:stroke joinstyle="miter"/>
+                <v:formulas>
+                  <v:f eqn="if lineDrawn pixelLineWidth 0"/>
+                  <v:f eqn="sum @0 1 0"/>
+                  <v:f eqn="sum 0 0 @1"/>
+                  <v:f eqn="prod @2 1 2"/>
+                  <v:f eqn="prod @3 21600 pixelWidth"/>
+                  <v:f eqn="prod @3 21600 pixelHeight"/>
+                  <v:f eqn="sum @0 0 1"/>
+                  <v:f eqn="prod @6 1 2"/>
+                  <v:f eqn="prod @7 21600 pixelWidth"/>
+                  <v:f eqn="sum @8 21600 0"/>
+                  <v:f eqn="prod @7 21600 pixelHeight"/>
+                  <v:f eqn="sum @10 21600 0"/>
+                </v:formulas>
+                <v:path o:extrusionok="f" gradientshapeok="t" o:connecttype="rect"/>
+                <o:lock v:ext="edit" aspectratio="t"/>
+              </v:shapetype>
+              <v:shape id="_x0000_i5" o:spid="_x0000_s5" type="#_x0000_t75" style="width:358.50pt;height:54.75pt;mso-wrap-distance-left:0.00pt;mso-wrap-distance-top:0.00pt;mso-wrap-distance-right:0.00pt;mso-wrap-distance-bottom:0.00pt;z-index:1;" stroked="false">
+                <v:imagedata r:id="rId15" o:title=""/>
+                <o:lock v:ext="edit" rotation="t"/>
+              </v:shape>
+            </w:pict>
+          </mc:Fallback>
+        </mc:AlternateContent>
+      </w:r>
+      <w:r/>
       <w:r/>
     </w:p>
     <w:p>
@@ -205,7 +654,151 @@
       </w:r>
       <w:r>
         <w:t xml:space="preserve">. </w:t>
+        <w:br/>
       </w:r>
+      <w:r>
+        <mc:AlternateContent>
+          <mc:Choice Requires="wpg">
+            <w:drawing>
+              <wp:inline xmlns:wp="http://schemas.openxmlformats.org/drawingml/2006/wordprocessingDrawing" distT="0" distB="0" distL="0" distR="0">
+                <wp:extent cx="5731510" cy="1453921"/>
+                <wp:effectExtent l="0" t="0" r="0" b="0"/>
+                <wp:docPr id="7" name=""/>
+                <wp:cNvGraphicFramePr>
+                  <a:graphicFrameLocks xmlns:a="http://schemas.openxmlformats.org/drawingml/2006/main" noChangeAspect="1"/>
+                </wp:cNvGraphicFramePr>
+                <a:graphic xmlns:a="http://schemas.openxmlformats.org/drawingml/2006/main">
+                  <a:graphicData uri="http://schemas.openxmlformats.org/drawingml/2006/picture">
+                    <pic:pic xmlns:pic="http://schemas.openxmlformats.org/drawingml/2006/picture">
+                      <pic:nvPicPr>
+                        <pic:cNvPr id="1314808689" name=""/>
+                        <pic:cNvPicPr>
+                          <a:picLocks noChangeAspect="1"/>
+                        </pic:cNvPicPr>
+                        <pic:nvPr/>
+                      </pic:nvPicPr>
+                      <pic:blipFill>
+                        <a:blip r:embed="rId16"/>
+                        <a:stretch/>
+                      </pic:blipFill>
+                      <pic:spPr bwMode="auto">
+                        <a:xfrm>
+                          <a:off x="0" y="0"/>
+                          <a:ext cx="5731509" cy="1453920"/>
+                        </a:xfrm>
+                        <a:prstGeom prst="rect">
+                          <a:avLst/>
+                        </a:prstGeom>
+                      </pic:spPr>
+                    </pic:pic>
+                  </a:graphicData>
+                </a:graphic>
+              </wp:inline>
+            </w:drawing>
+          </mc:Choice>
+          <mc:Fallback>
+            <w:pict>
+              <v:shapetype id="_x0000_t75" coordsize="21600,21600" o:spt="75" o:preferrelative="t" path="m@4@5l@4@11@9@11@9@5xe" filled="f" stroked="f">
+                <v:stroke joinstyle="miter"/>
+                <v:formulas>
+                  <v:f eqn="if lineDrawn pixelLineWidth 0"/>
+                  <v:f eqn="sum @0 1 0"/>
+                  <v:f eqn="sum 0 0 @1"/>
+                  <v:f eqn="prod @2 1 2"/>
+                  <v:f eqn="prod @3 21600 pixelWidth"/>
+                  <v:f eqn="prod @3 21600 pixelHeight"/>
+                  <v:f eqn="sum @0 0 1"/>
+                  <v:f eqn="prod @6 1 2"/>
+                  <v:f eqn="prod @7 21600 pixelWidth"/>
+                  <v:f eqn="sum @8 21600 0"/>
+                  <v:f eqn="prod @7 21600 pixelHeight"/>
+                  <v:f eqn="sum @10 21600 0"/>
+                </v:formulas>
+                <v:path o:extrusionok="f" gradientshapeok="t" o:connecttype="rect"/>
+                <o:lock v:ext="edit" aspectratio="t"/>
+              </v:shapetype>
+              <v:shape id="_x0000_i6" o:spid="_x0000_s6" type="#_x0000_t75" style="width:451.30pt;height:114.48pt;mso-wrap-distance-left:0.00pt;mso-wrap-distance-top:0.00pt;mso-wrap-distance-right:0.00pt;mso-wrap-distance-bottom:0.00pt;z-index:1;" stroked="false">
+                <v:imagedata r:id="rId16" o:title=""/>
+                <o:lock v:ext="edit" rotation="t"/>
+              </v:shape>
+            </w:pict>
+          </mc:Fallback>
+        </mc:AlternateContent>
+      </w:r>
+      <w:r>
+        <w:br/>
+        <w:br/>
+      </w:r>
+      <w:r>
+        <mc:AlternateContent>
+          <mc:Choice Requires="wpg">
+            <w:drawing>
+              <wp:inline xmlns:wp="http://schemas.openxmlformats.org/drawingml/2006/wordprocessingDrawing" distT="0" distB="0" distL="0" distR="0">
+                <wp:extent cx="5143500" cy="676275"/>
+                <wp:effectExtent l="0" t="0" r="0" b="0"/>
+                <wp:docPr id="8" name=""/>
+                <wp:cNvGraphicFramePr>
+                  <a:graphicFrameLocks xmlns:a="http://schemas.openxmlformats.org/drawingml/2006/main" noChangeAspect="1"/>
+                </wp:cNvGraphicFramePr>
+                <a:graphic xmlns:a="http://schemas.openxmlformats.org/drawingml/2006/main">
+                  <a:graphicData uri="http://schemas.openxmlformats.org/drawingml/2006/picture">
+                    <pic:pic xmlns:pic="http://schemas.openxmlformats.org/drawingml/2006/picture">
+                      <pic:nvPicPr>
+                        <pic:cNvPr id="1031215105" name=""/>
+                        <pic:cNvPicPr>
+                          <a:picLocks noChangeAspect="1"/>
+                        </pic:cNvPicPr>
+                        <pic:nvPr/>
+                      </pic:nvPicPr>
+                      <pic:blipFill>
+                        <a:blip r:embed="rId17"/>
+                        <a:stretch/>
+                      </pic:blipFill>
+                      <pic:spPr bwMode="auto">
+                        <a:xfrm>
+                          <a:off x="0" y="0"/>
+                          <a:ext cx="5143500" cy="676274"/>
+                        </a:xfrm>
+                        <a:prstGeom prst="rect">
+                          <a:avLst/>
+                        </a:prstGeom>
+                      </pic:spPr>
+                    </pic:pic>
+                  </a:graphicData>
+                </a:graphic>
+              </wp:inline>
+            </w:drawing>
+          </mc:Choice>
+          <mc:Fallback>
+            <w:pict>
+              <v:shapetype id="_x0000_t75" coordsize="21600,21600" o:spt="75" o:preferrelative="t" path="m@4@5l@4@11@9@11@9@5xe" filled="f" stroked="f">
+                <v:stroke joinstyle="miter"/>
+                <v:formulas>
+                  <v:f eqn="if lineDrawn pixelLineWidth 0"/>
+                  <v:f eqn="sum @0 1 0"/>
+                  <v:f eqn="sum 0 0 @1"/>
+                  <v:f eqn="prod @2 1 2"/>
+                  <v:f eqn="prod @3 21600 pixelWidth"/>
+                  <v:f eqn="prod @3 21600 pixelHeight"/>
+                  <v:f eqn="sum @0 0 1"/>
+                  <v:f eqn="prod @6 1 2"/>
+                  <v:f eqn="prod @7 21600 pixelWidth"/>
+                  <v:f eqn="sum @8 21600 0"/>
+                  <v:f eqn="prod @7 21600 pixelHeight"/>
+                  <v:f eqn="sum @10 21600 0"/>
+                </v:formulas>
+                <v:path o:extrusionok="f" gradientshapeok="t" o:connecttype="rect"/>
+                <o:lock v:ext="edit" aspectratio="t"/>
+              </v:shapetype>
+              <v:shape id="_x0000_i7" o:spid="_x0000_s7" type="#_x0000_t75" style="width:405.00pt;height:53.25pt;mso-wrap-distance-left:0.00pt;mso-wrap-distance-top:0.00pt;mso-wrap-distance-right:0.00pt;mso-wrap-distance-bottom:0.00pt;z-index:1;" stroked="false">
+                <v:imagedata r:id="rId17" o:title=""/>
+                <o:lock v:ext="edit" rotation="t"/>
+              </v:shape>
+            </w:pict>
+          </mc:Fallback>
+        </mc:AlternateContent>
+      </w:r>
+      <w:r/>
       <w:r/>
     </w:p>
     <w:p>
@@ -234,6 +827,158 @@
       </w:r>
       <w:r>
         <w:t xml:space="preserve"> getal</w:t>
+        <w:br/>
+      </w:r>
+      <w:r/>
+      <w:r>
+        <mc:AlternateContent>
+          <mc:Choice Requires="wpg">
+            <w:drawing>
+              <wp:inline xmlns:wp="http://schemas.openxmlformats.org/drawingml/2006/wordprocessingDrawing" distT="0" distB="0" distL="0" distR="0">
+                <wp:extent cx="5267325" cy="1876425"/>
+                <wp:effectExtent l="0" t="0" r="0" b="0"/>
+                <wp:docPr id="9" name=""/>
+                <wp:cNvGraphicFramePr>
+                  <a:graphicFrameLocks xmlns:a="http://schemas.openxmlformats.org/drawingml/2006/main" noChangeAspect="1"/>
+                </wp:cNvGraphicFramePr>
+                <a:graphic xmlns:a="http://schemas.openxmlformats.org/drawingml/2006/main">
+                  <a:graphicData uri="http://schemas.openxmlformats.org/drawingml/2006/picture">
+                    <pic:pic xmlns:pic="http://schemas.openxmlformats.org/drawingml/2006/picture">
+                      <pic:nvPicPr>
+                        <pic:cNvPr id="701868114" name=""/>
+                        <pic:cNvPicPr>
+                          <a:picLocks noChangeAspect="1"/>
+                        </pic:cNvPicPr>
+                        <pic:nvPr/>
+                      </pic:nvPicPr>
+                      <pic:blipFill>
+                        <a:blip r:embed="rId18"/>
+                        <a:stretch/>
+                      </pic:blipFill>
+                      <pic:spPr bwMode="auto">
+                        <a:xfrm>
+                          <a:off x="0" y="0"/>
+                          <a:ext cx="5267324" cy="1876424"/>
+                        </a:xfrm>
+                        <a:prstGeom prst="rect">
+                          <a:avLst/>
+                        </a:prstGeom>
+                      </pic:spPr>
+                    </pic:pic>
+                  </a:graphicData>
+                </a:graphic>
+              </wp:inline>
+            </w:drawing>
+          </mc:Choice>
+          <mc:Fallback>
+            <w:pict>
+              <v:shapetype id="_x0000_t75" coordsize="21600,21600" o:spt="75" o:preferrelative="t" path="m@4@5l@4@11@9@11@9@5xe" filled="f" stroked="f">
+                <v:stroke joinstyle="miter"/>
+                <v:formulas>
+                  <v:f eqn="if lineDrawn pixelLineWidth 0"/>
+                  <v:f eqn="sum @0 1 0"/>
+                  <v:f eqn="sum 0 0 @1"/>
+                  <v:f eqn="prod @2 1 2"/>
+                  <v:f eqn="prod @3 21600 pixelWidth"/>
+                  <v:f eqn="prod @3 21600 pixelHeight"/>
+                  <v:f eqn="sum @0 0 1"/>
+                  <v:f eqn="prod @6 1 2"/>
+                  <v:f eqn="prod @7 21600 pixelWidth"/>
+                  <v:f eqn="sum @8 21600 0"/>
+                  <v:f eqn="prod @7 21600 pixelHeight"/>
+                  <v:f eqn="sum @10 21600 0"/>
+                </v:formulas>
+                <v:path o:extrusionok="f" gradientshapeok="t" o:connecttype="rect"/>
+                <o:lock v:ext="edit" aspectratio="t"/>
+              </v:shapetype>
+              <v:shape id="_x0000_i8" o:spid="_x0000_s8" type="#_x0000_t75" style="width:414.75pt;height:147.75pt;mso-wrap-distance-left:0.00pt;mso-wrap-distance-top:0.00pt;mso-wrap-distance-right:0.00pt;mso-wrap-distance-bottom:0.00pt;z-index:1;" stroked="false">
+                <v:imagedata r:id="rId18" o:title=""/>
+                <o:lock v:ext="edit" rotation="t"/>
+              </v:shape>
+            </w:pict>
+          </mc:Fallback>
+        </mc:AlternateContent>
+        <w:br/>
+        <w:br/>
+      </w:r>
+      <w:r>
+        <w:rPr>
+          <w:lang w:val="en-GB"/>
+        </w:rPr>
+      </w:r>
+      <w:r>
+        <mc:AlternateContent>
+          <mc:Choice Requires="wpg">
+            <w:drawing>
+              <wp:inline xmlns:wp="http://schemas.openxmlformats.org/drawingml/2006/wordprocessingDrawing" distT="0" distB="0" distL="0" distR="0">
+                <wp:extent cx="4248150" cy="561975"/>
+                <wp:effectExtent l="0" t="0" r="0" b="0"/>
+                <wp:docPr id="10" name=""/>
+                <wp:cNvGraphicFramePr>
+                  <a:graphicFrameLocks xmlns:a="http://schemas.openxmlformats.org/drawingml/2006/main" noChangeAspect="1"/>
+                </wp:cNvGraphicFramePr>
+                <a:graphic xmlns:a="http://schemas.openxmlformats.org/drawingml/2006/main">
+                  <a:graphicData uri="http://schemas.openxmlformats.org/drawingml/2006/picture">
+                    <pic:pic xmlns:pic="http://schemas.openxmlformats.org/drawingml/2006/picture">
+                      <pic:nvPicPr>
+                        <pic:cNvPr id="1659421646" name=""/>
+                        <pic:cNvPicPr>
+                          <a:picLocks noChangeAspect="1"/>
+                        </pic:cNvPicPr>
+                        <pic:nvPr/>
+                      </pic:nvPicPr>
+                      <pic:blipFill>
+                        <a:blip r:embed="rId19"/>
+                        <a:stretch/>
+                      </pic:blipFill>
+                      <pic:spPr bwMode="auto">
+                        <a:xfrm>
+                          <a:off x="0" y="0"/>
+                          <a:ext cx="4248149" cy="561974"/>
+                        </a:xfrm>
+                        <a:prstGeom prst="rect">
+                          <a:avLst/>
+                        </a:prstGeom>
+                      </pic:spPr>
+                    </pic:pic>
+                  </a:graphicData>
+                </a:graphic>
+              </wp:inline>
+            </w:drawing>
+          </mc:Choice>
+          <mc:Fallback>
+            <w:pict>
+              <v:shapetype id="_x0000_t75" coordsize="21600,21600" o:spt="75" o:preferrelative="t" path="m@4@5l@4@11@9@11@9@5xe" filled="f" stroked="f">
+                <v:stroke joinstyle="miter"/>
+                <v:formulas>
+                  <v:f eqn="if lineDrawn pixelLineWidth 0"/>
+                  <v:f eqn="sum @0 1 0"/>
+                  <v:f eqn="sum 0 0 @1"/>
+                  <v:f eqn="prod @2 1 2"/>
+                  <v:f eqn="prod @3 21600 pixelWidth"/>
+                  <v:f eqn="prod @3 21600 pixelHeight"/>
+                  <v:f eqn="sum @0 0 1"/>
+                  <v:f eqn="prod @6 1 2"/>
+                  <v:f eqn="prod @7 21600 pixelWidth"/>
+                  <v:f eqn="sum @8 21600 0"/>
+                  <v:f eqn="prod @7 21600 pixelHeight"/>
+                  <v:f eqn="sum @10 21600 0"/>
+                </v:formulas>
+                <v:path o:extrusionok="f" gradientshapeok="t" o:connecttype="rect"/>
+                <o:lock v:ext="edit" aspectratio="t"/>
+              </v:shapetype>
+              <v:shape id="_x0000_i9" o:spid="_x0000_s9" type="#_x0000_t75" style="width:334.50pt;height:44.25pt;mso-wrap-distance-left:0.00pt;mso-wrap-distance-top:0.00pt;mso-wrap-distance-right:0.00pt;mso-wrap-distance-bottom:0.00pt;z-index:1;" stroked="false">
+                <v:imagedata r:id="rId19" o:title=""/>
+                <o:lock v:ext="edit" rotation="t"/>
+              </v:shape>
+            </w:pict>
+          </mc:Fallback>
+        </mc:AlternateContent>
+      </w:r>
+      <w:r>
+        <w:rPr>
+          <w:lang w:val="en-GB"/>
+        </w:rPr>
       </w:r>
       <w:r/>
     </w:p>
@@ -254,7 +999,67 @@
       </w:r>
       <w:r>
         <w:t xml:space="preserve"> voorkomt.</w:t>
+        <w:br/>
       </w:r>
+      <w:r>
+        <w:rPr>
+          <w:color w:val="4472c4" w:themeColor="accent1"/>
+        </w:rPr>
+        <w:t xml:space="preserve">Nee, dit probleem komt niet alleen in C voor. Integer overflow en underflow zijn een eigenschap van hoe de hardware (CPU)  met een vast aantal bits werkt (two's complement), niet van de taal C  zelf. Elke taal die met vaste-grootte integers werkt heeft hie</w:t>
+      </w:r>
+      <w:r>
+        <w:rPr>
+          <w:color w:val="4472c4" w:themeColor="accent1"/>
+        </w:rPr>
+        <w:t xml:space="preserve">r last van.</w:t>
+        <w:br/>
+      </w:r>
+      <w:r>
+        <w:rPr>
+          <w:color w:val="4472c4" w:themeColor="accent1"/>
+        </w:rPr>
+        <w:t xml:space="preserve">Alleen talen met arbitrary precision integers</w:t>
+      </w:r>
+      <w:r>
+        <w:rPr>
+          <w:color w:val="4472c4" w:themeColor="accent1"/>
+          <w:lang w:val="en-GB"/>
+        </w:rPr>
+        <w:t xml:space="preserve">[</w:t>
+      </w:r>
+      <w:r>
+        <w:rPr>
+          <w:color w:val="4472c4" w:themeColor="accent1"/>
+        </w:rPr>
+        <w:t xml:space="preserve">integers waarvan de grootte niet vast ligt</w:t>
+      </w:r>
+      <w:r>
+        <w:rPr>
+          <w:color w:val="4472c4" w:themeColor="accent1"/>
+          <w:lang w:val="en-GB"/>
+        </w:rPr>
+        <w:t xml:space="preserve">]</w:t>
+      </w:r>
+      <w:r>
+        <w:rPr>
+          <w:color w:val="4472c4" w:themeColor="accent1"/>
+        </w:rPr>
+        <w:t xml:space="preserve"> (zoals Python) hebben er fundamenteel geen last van, omdat getallen daar gewoon groter mogen worden in geheugen.</w:t>
+      </w:r>
+      <w:r>
+        <w:rPr>
+          <w:color w:val="4472c4" w:themeColor="accent1"/>
+        </w:rPr>
+        <w:br/>
+      </w:r>
+      <w:r>
+        <w:rPr>
+          <w:color w:val="4472c4" w:themeColor="accent1"/>
+          <w:lang w:val="en-GB"/>
+        </w:rPr>
+        <w:t xml:space="preserve">en c heeft gewoon geen checks om dit soort problemen te voorkomen</w:t>
+      </w:r>
+      <w:r/>
       <w:r/>
     </w:p>
     <w:p>
@@ -270,10 +1075,182 @@
         <w:rPr/>
       </w:pPr>
       <w:r>
+        <w:rPr>
+          <w:lang w:val="en-GB"/>
+        </w:rPr>
+        <w:t xml:space="preserve">Optioneel</w:t>
+      </w:r>
+      <w:r>
+        <w:br/>
+      </w:r>
+      <w:r/>
+      <w:r/>
+    </w:p>
+    <w:p>
+      <w:pPr>
+        <w:pStyle w:val="631"/>
+        <w:numPr>
+          <w:ilvl w:val="0"/>
+          <w:numId w:val="1"/>
+        </w:numPr>
+        <w:pBdr/>
+        <w:spacing/>
+        <w:ind/>
+        <w:rPr/>
+      </w:pPr>
+      <w:r>
         <w:t xml:space="preserve">Maak een voorbeeld van casting van</w:t>
       </w:r>
       <w:r>
         <w:t xml:space="preserve"> geheel getal met verschillend aantal bits dat nooit problemen oplevert</w:t>
+        <w:br/>
+      </w:r>
+      <w:r/>
+      <w:r>
+        <mc:AlternateContent>
+          <mc:Choice Requires="wpg">
+            <w:drawing>
+              <wp:inline xmlns:wp="http://schemas.openxmlformats.org/drawingml/2006/wordprocessingDrawing" distT="0" distB="0" distL="0" distR="0">
+                <wp:extent cx="5619750" cy="1905000"/>
+                <wp:effectExtent l="0" t="0" r="0" b="0"/>
+                <wp:docPr id="11" name=""/>
+                <wp:cNvGraphicFramePr>
+                  <a:graphicFrameLocks xmlns:a="http://schemas.openxmlformats.org/drawingml/2006/main" noChangeAspect="1"/>
+                </wp:cNvGraphicFramePr>
+                <a:graphic xmlns:a="http://schemas.openxmlformats.org/drawingml/2006/main">
+                  <a:graphicData uri="http://schemas.openxmlformats.org/drawingml/2006/picture">
+                    <pic:pic xmlns:pic="http://schemas.openxmlformats.org/drawingml/2006/picture">
+                      <pic:nvPicPr>
+                        <pic:cNvPr id="2125833838" name=""/>
+                        <pic:cNvPicPr>
+                          <a:picLocks noChangeAspect="1"/>
+                        </pic:cNvPicPr>
+                        <pic:nvPr/>
+                      </pic:nvPicPr>
+                      <pic:blipFill>
+                        <a:blip r:embed="rId20"/>
+                        <a:stretch/>
+                      </pic:blipFill>
+                      <pic:spPr bwMode="auto">
+                        <a:xfrm>
+                          <a:off x="0" y="0"/>
+                          <a:ext cx="5619749" cy="1904999"/>
+                        </a:xfrm>
+                        <a:prstGeom prst="rect">
+                          <a:avLst/>
+                        </a:prstGeom>
+                      </pic:spPr>
+                    </pic:pic>
+                  </a:graphicData>
+                </a:graphic>
+              </wp:inline>
+            </w:drawing>
+          </mc:Choice>
+          <mc:Fallback>
+            <w:pict>
+              <v:shapetype id="_x0000_t75" coordsize="21600,21600" o:spt="75" o:preferrelative="t" path="m@4@5l@4@11@9@11@9@5xe" filled="f" stroked="f">
+                <v:stroke joinstyle="miter"/>
+                <v:formulas>
+                  <v:f eqn="if lineDrawn pixelLineWidth 0"/>
+                  <v:f eqn="sum @0 1 0"/>
+                  <v:f eqn="sum 0 0 @1"/>
+                  <v:f eqn="prod @2 1 2"/>
+                  <v:f eqn="prod @3 21600 pixelWidth"/>
+                  <v:f eqn="prod @3 21600 pixelHeight"/>
+                  <v:f eqn="sum @0 0 1"/>
+                  <v:f eqn="prod @6 1 2"/>
+                  <v:f eqn="prod @7 21600 pixelWidth"/>
+                  <v:f eqn="sum @8 21600 0"/>
+                  <v:f eqn="prod @7 21600 pixelHeight"/>
+                  <v:f eqn="sum @10 21600 0"/>
+                </v:formulas>
+                <v:path o:extrusionok="f" gradientshapeok="t" o:connecttype="rect"/>
+                <o:lock v:ext="edit" aspectratio="t"/>
+              </v:shapetype>
+              <v:shape id="_x0000_i10" o:spid="_x0000_s10" type="#_x0000_t75" style="width:442.50pt;height:150.00pt;mso-wrap-distance-left:0.00pt;mso-wrap-distance-top:0.00pt;mso-wrap-distance-right:0.00pt;mso-wrap-distance-bottom:0.00pt;z-index:1;" stroked="false">
+                <v:imagedata r:id="rId20" o:title=""/>
+                <o:lock v:ext="edit" rotation="t"/>
+              </v:shape>
+            </w:pict>
+          </mc:Fallback>
+        </mc:AlternateContent>
+      </w:r>
+      <w:r/>
+      <w:r>
+        <w:br/>
+        <w:br/>
+      </w:r>
+      <w:r>
+        <mc:AlternateContent>
+          <mc:Choice Requires="wpg">
+            <w:drawing>
+              <wp:inline xmlns:wp="http://schemas.openxmlformats.org/drawingml/2006/wordprocessingDrawing" distT="0" distB="0" distL="0" distR="0">
+                <wp:extent cx="4648200" cy="466725"/>
+                <wp:effectExtent l="0" t="0" r="0" b="0"/>
+                <wp:docPr id="12" name=""/>
+                <wp:cNvGraphicFramePr>
+                  <a:graphicFrameLocks xmlns:a="http://schemas.openxmlformats.org/drawingml/2006/main" noChangeAspect="1"/>
+                </wp:cNvGraphicFramePr>
+                <a:graphic xmlns:a="http://schemas.openxmlformats.org/drawingml/2006/main">
+                  <a:graphicData uri="http://schemas.openxmlformats.org/drawingml/2006/picture">
+                    <pic:pic xmlns:pic="http://schemas.openxmlformats.org/drawingml/2006/picture">
+                      <pic:nvPicPr>
+                        <pic:cNvPr id="653841356" name=""/>
+                        <pic:cNvPicPr>
+                          <a:picLocks noChangeAspect="1"/>
+                        </pic:cNvPicPr>
+                        <pic:nvPr/>
+                      </pic:nvPicPr>
+                      <pic:blipFill>
+                        <a:blip r:embed="rId21"/>
+                        <a:stretch/>
+                      </pic:blipFill>
+                      <pic:spPr bwMode="auto">
+                        <a:xfrm>
+                          <a:off x="0" y="0"/>
+                          <a:ext cx="4648199" cy="466724"/>
+                        </a:xfrm>
+                        <a:prstGeom prst="rect">
+                          <a:avLst/>
+                        </a:prstGeom>
+                      </pic:spPr>
+                    </pic:pic>
+                  </a:graphicData>
+                </a:graphic>
+              </wp:inline>
+            </w:drawing>
+          </mc:Choice>
+          <mc:Fallback>
+            <w:pict>
+              <v:shapetype id="_x0000_t75" coordsize="21600,21600" o:spt="75" o:preferrelative="t" path="m@4@5l@4@11@9@11@9@5xe" filled="f" stroked="f">
+                <v:stroke joinstyle="miter"/>
+                <v:formulas>
+                  <v:f eqn="if lineDrawn pixelLineWidth 0"/>
+                  <v:f eqn="sum @0 1 0"/>
+                  <v:f eqn="sum 0 0 @1"/>
+                  <v:f eqn="prod @2 1 2"/>
+                  <v:f eqn="prod @3 21600 pixelWidth"/>
+                  <v:f eqn="prod @3 21600 pixelHeight"/>
+                  <v:f eqn="sum @0 0 1"/>
+                  <v:f eqn="prod @6 1 2"/>
+                  <v:f eqn="prod @7 21600 pixelWidth"/>
+                  <v:f eqn="sum @8 21600 0"/>
+                  <v:f eqn="prod @7 21600 pixelHeight"/>
+                  <v:f eqn="sum @10 21600 0"/>
+                </v:formulas>
+                <v:path o:extrusionok="f" gradientshapeok="t" o:connecttype="rect"/>
+                <o:lock v:ext="edit" aspectratio="t"/>
+              </v:shapetype>
+              <v:shape id="_x0000_i11" o:spid="_x0000_s11" type="#_x0000_t75" style="width:366.00pt;height:36.75pt;mso-wrap-distance-left:0.00pt;mso-wrap-distance-top:0.00pt;mso-wrap-distance-right:0.00pt;mso-wrap-distance-bottom:0.00pt;z-index:1;" stroked="false">
+                <v:imagedata r:id="rId21" o:title=""/>
+                <o:lock v:ext="edit" rotation="t"/>
+              </v:shape>
+            </w:pict>
+          </mc:Fallback>
+        </mc:AlternateContent>
+      </w:r>
+      <w:r>
+        <w:br/>
       </w:r>
       <w:r/>
     </w:p>
@@ -300,8 +1277,175 @@
         <w:pBdr/>
         <w:spacing/>
         <w:ind/>
+        <w:rPr>
+          <w:highlight w:val="none"/>
+        </w:rPr>
+      </w:pPr>
+      <w:r>
+        <mc:AlternateContent>
+          <mc:Choice Requires="wpg">
+            <w:drawing>
+              <wp:inline xmlns:wp="http://schemas.openxmlformats.org/drawingml/2006/wordprocessingDrawing" distT="0" distB="0" distL="0" distR="0">
+                <wp:extent cx="5731510" cy="2023968"/>
+                <wp:effectExtent l="0" t="0" r="0" b="0"/>
+                <wp:docPr id="13" name=""/>
+                <wp:cNvGraphicFramePr>
+                  <a:graphicFrameLocks xmlns:a="http://schemas.openxmlformats.org/drawingml/2006/main" noChangeAspect="1"/>
+                </wp:cNvGraphicFramePr>
+                <a:graphic xmlns:a="http://schemas.openxmlformats.org/drawingml/2006/main">
+                  <a:graphicData uri="http://schemas.openxmlformats.org/drawingml/2006/picture">
+                    <pic:pic xmlns:pic="http://schemas.openxmlformats.org/drawingml/2006/picture">
+                      <pic:nvPicPr>
+                        <pic:cNvPr id="1591802898" name=""/>
+                        <pic:cNvPicPr>
+                          <a:picLocks noChangeAspect="1"/>
+                        </pic:cNvPicPr>
+                        <pic:nvPr/>
+                      </pic:nvPicPr>
+                      <pic:blipFill>
+                        <a:blip r:embed="rId22"/>
+                        <a:stretch/>
+                      </pic:blipFill>
+                      <pic:spPr bwMode="auto">
+                        <a:xfrm>
+                          <a:off x="0" y="0"/>
+                          <a:ext cx="5731509" cy="2023967"/>
+                        </a:xfrm>
+                        <a:prstGeom prst="rect">
+                          <a:avLst/>
+                        </a:prstGeom>
+                      </pic:spPr>
+                    </pic:pic>
+                  </a:graphicData>
+                </a:graphic>
+              </wp:inline>
+            </w:drawing>
+          </mc:Choice>
+          <mc:Fallback>
+            <w:pict>
+              <v:shapetype id="_x0000_t75" coordsize="21600,21600" o:spt="75" o:preferrelative="t" path="m@4@5l@4@11@9@11@9@5xe" filled="f" stroked="f">
+                <v:stroke joinstyle="miter"/>
+                <v:formulas>
+                  <v:f eqn="if lineDrawn pixelLineWidth 0"/>
+                  <v:f eqn="sum @0 1 0"/>
+                  <v:f eqn="sum 0 0 @1"/>
+                  <v:f eqn="prod @2 1 2"/>
+                  <v:f eqn="prod @3 21600 pixelWidth"/>
+                  <v:f eqn="prod @3 21600 pixelHeight"/>
+                  <v:f eqn="sum @0 0 1"/>
+                  <v:f eqn="prod @6 1 2"/>
+                  <v:f eqn="prod @7 21600 pixelWidth"/>
+                  <v:f eqn="sum @8 21600 0"/>
+                  <v:f eqn="prod @7 21600 pixelHeight"/>
+                  <v:f eqn="sum @10 21600 0"/>
+                </v:formulas>
+                <v:path o:extrusionok="f" gradientshapeok="t" o:connecttype="rect"/>
+                <o:lock v:ext="edit" aspectratio="t"/>
+              </v:shapetype>
+              <v:shape id="_x0000_i12" o:spid="_x0000_s12" type="#_x0000_t75" style="width:451.30pt;height:159.37pt;mso-wrap-distance-left:0.00pt;mso-wrap-distance-top:0.00pt;mso-wrap-distance-right:0.00pt;mso-wrap-distance-bottom:0.00pt;z-index:1;" stroked="false">
+                <v:imagedata r:id="rId22" o:title=""/>
+                <o:lock v:ext="edit" rotation="t"/>
+              </v:shape>
+            </w:pict>
+          </mc:Fallback>
+        </mc:AlternateContent>
+        <w:br/>
+      </w:r>
+      <w:r/>
+      <w:r/>
+    </w:p>
+    <w:p>
+      <w:pPr>
+        <w:pStyle w:val="631"/>
+        <w:pBdr/>
+        <w:spacing/>
+        <w:ind/>
         <w:rPr/>
       </w:pPr>
+      <w:r>
+        <w:rPr>
+          <w:highlight w:val="none"/>
+        </w:rPr>
+      </w:r>
+      <w:r>
+        <mc:AlternateContent>
+          <mc:Choice Requires="wpg">
+            <w:drawing>
+              <wp:inline xmlns:wp="http://schemas.openxmlformats.org/drawingml/2006/wordprocessingDrawing" distT="0" distB="0" distL="0" distR="0">
+                <wp:extent cx="4810125" cy="714375"/>
+                <wp:effectExtent l="0" t="0" r="0" b="0"/>
+                <wp:docPr id="14" name=""/>
+                <wp:cNvGraphicFramePr>
+                  <a:graphicFrameLocks xmlns:a="http://schemas.openxmlformats.org/drawingml/2006/main" noChangeAspect="1"/>
+                </wp:cNvGraphicFramePr>
+                <a:graphic xmlns:a="http://schemas.openxmlformats.org/drawingml/2006/main">
+                  <a:graphicData uri="http://schemas.openxmlformats.org/drawingml/2006/picture">
+                    <pic:pic xmlns:pic="http://schemas.openxmlformats.org/drawingml/2006/picture">
+                      <pic:nvPicPr>
+                        <pic:cNvPr id="1513852640" name=""/>
+                        <pic:cNvPicPr>
+                          <a:picLocks noChangeAspect="1"/>
+                        </pic:cNvPicPr>
+                        <pic:nvPr/>
+                      </pic:nvPicPr>
+                      <pic:blipFill>
+                        <a:blip r:embed="rId23"/>
+                        <a:stretch/>
+                      </pic:blipFill>
+                      <pic:spPr bwMode="auto">
+                        <a:xfrm>
+                          <a:off x="0" y="0"/>
+                          <a:ext cx="4810124" cy="714375"/>
+                        </a:xfrm>
+                        <a:prstGeom prst="rect">
+                          <a:avLst/>
+                        </a:prstGeom>
+                      </pic:spPr>
+                    </pic:pic>
+                  </a:graphicData>
+                </a:graphic>
+              </wp:inline>
+            </w:drawing>
+          </mc:Choice>
+          <mc:Fallback>
+            <w:pict>
+              <v:shapetype id="_x0000_t75" coordsize="21600,21600" o:spt="75" o:preferrelative="t" path="m@4@5l@4@11@9@11@9@5xe" filled="f" stroked="f">
+                <v:stroke joinstyle="miter"/>
+                <v:formulas>
+                  <v:f eqn="if lineDrawn pixelLineWidth 0"/>
+                  <v:f eqn="sum @0 1 0"/>
+                  <v:f eqn="sum 0 0 @1"/>
+                  <v:f eqn="prod @2 1 2"/>
+                  <v:f eqn="prod @3 21600 pixelWidth"/>
+                  <v:f eqn="prod @3 21600 pixelHeight"/>
+                  <v:f eqn="sum @0 0 1"/>
+                  <v:f eqn="prod @6 1 2"/>
+                  <v:f eqn="prod @7 21600 pixelWidth"/>
+                  <v:f eqn="sum @8 21600 0"/>
+                  <v:f eqn="prod @7 21600 pixelHeight"/>
+                  <v:f eqn="sum @10 21600 0"/>
+                </v:formulas>
+                <v:path o:extrusionok="f" gradientshapeok="t" o:connecttype="rect"/>
+                <o:lock v:ext="edit" aspectratio="t"/>
+              </v:shapetype>
+              <v:shape id="_x0000_i13" o:spid="_x0000_s13" type="#_x0000_t75" style="width:378.75pt;height:56.25pt;mso-wrap-distance-left:0.00pt;mso-wrap-distance-top:0.00pt;mso-wrap-distance-right:0.00pt;mso-wrap-distance-bottom:0.00pt;z-index:1;" stroked="false">
+                <v:imagedata r:id="rId23" o:title=""/>
+                <o:lock v:ext="edit" rotation="t"/>
+              </v:shape>
+            </w:pict>
+          </mc:Fallback>
+        </mc:AlternateContent>
+      </w:r>
+      <w:r/>
+      <w:r>
+        <w:br/>
+      </w:r>
+      <w:r/>
+      <w:r>
+        <w:rPr>
+          <w:highlight w:val="none"/>
+        </w:rPr>
+      </w:r>
       <w:r/>
       <w:r/>
     </w:p>
@@ -326,7 +1470,7 @@
         <w:pStyle w:val="631"/>
         <w:numPr>
           <w:ilvl w:val="0"/>
-          <w:numId w:val="2"/>
+          <w:numId w:val="4"/>
         </w:numPr>
         <w:pBdr/>
         <w:spacing/>
@@ -361,7 +1505,7 @@
         <w:pStyle w:val="631"/>
         <w:numPr>
           <w:ilvl w:val="0"/>
-          <w:numId w:val="2"/>
+          <w:numId w:val="4"/>
         </w:numPr>
         <w:pBdr/>
         <w:spacing/>
@@ -376,8 +1520,286 @@
       </w:r>
       <w:r/>
       <w:r/>
+    </w:p>
+    <w:p>
+      <w:pPr>
+        <w:pBdr/>
+        <w:spacing/>
+        <w:ind w:firstLine="0" w:left="720"/>
+        <w:rPr/>
+      </w:pPr>
+      <w:r>
+        <w:br/>
+      </w:r>
+      <w:r>
+        <mc:AlternateContent>
+          <mc:Choice Requires="wpg">
+            <w:drawing>
+              <wp:inline xmlns:wp="http://schemas.openxmlformats.org/drawingml/2006/wordprocessingDrawing" distT="0" distB="0" distL="0" distR="0">
+                <wp:extent cx="5731510" cy="4007320"/>
+                <wp:effectExtent l="0" t="0" r="0" b="0"/>
+                <wp:docPr id="15" name=""/>
+                <wp:cNvGraphicFramePr>
+                  <a:graphicFrameLocks xmlns:a="http://schemas.openxmlformats.org/drawingml/2006/main" noChangeAspect="1"/>
+                </wp:cNvGraphicFramePr>
+                <a:graphic xmlns:a="http://schemas.openxmlformats.org/drawingml/2006/main">
+                  <a:graphicData uri="http://schemas.openxmlformats.org/drawingml/2006/picture">
+                    <pic:pic xmlns:pic="http://schemas.openxmlformats.org/drawingml/2006/picture">
+                      <pic:nvPicPr>
+                        <pic:cNvPr id="594325286" name=""/>
+                        <pic:cNvPicPr>
+                          <a:picLocks noChangeAspect="1"/>
+                        </pic:cNvPicPr>
+                        <pic:nvPr/>
+                      </pic:nvPicPr>
+                      <pic:blipFill>
+                        <a:blip r:embed="rId24"/>
+                        <a:stretch/>
+                      </pic:blipFill>
+                      <pic:spPr bwMode="auto">
+                        <a:xfrm>
+                          <a:off x="0" y="0"/>
+                          <a:ext cx="5731509" cy="4007320"/>
+                        </a:xfrm>
+                        <a:prstGeom prst="rect">
+                          <a:avLst/>
+                        </a:prstGeom>
+                      </pic:spPr>
+                    </pic:pic>
+                  </a:graphicData>
+                </a:graphic>
+              </wp:inline>
+            </w:drawing>
+          </mc:Choice>
+          <mc:Fallback>
+            <w:pict>
+              <v:shapetype id="_x0000_t75" coordsize="21600,21600" o:spt="75" o:preferrelative="t" path="m@4@5l@4@11@9@11@9@5xe" filled="f" stroked="f">
+                <v:stroke joinstyle="miter"/>
+                <v:formulas>
+                  <v:f eqn="if lineDrawn pixelLineWidth 0"/>
+                  <v:f eqn="sum @0 1 0"/>
+                  <v:f eqn="sum 0 0 @1"/>
+                  <v:f eqn="prod @2 1 2"/>
+                  <v:f eqn="prod @3 21600 pixelWidth"/>
+                  <v:f eqn="prod @3 21600 pixelHeight"/>
+                  <v:f eqn="sum @0 0 1"/>
+                  <v:f eqn="prod @6 1 2"/>
+                  <v:f eqn="prod @7 21600 pixelWidth"/>
+                  <v:f eqn="sum @8 21600 0"/>
+                  <v:f eqn="prod @7 21600 pixelHeight"/>
+                  <v:f eqn="sum @10 21600 0"/>
+                </v:formulas>
+                <v:path o:extrusionok="f" gradientshapeok="t" o:connecttype="rect"/>
+                <o:lock v:ext="edit" aspectratio="t"/>
+              </v:shapetype>
+              <v:shape id="_x0000_i14" o:spid="_x0000_s14" type="#_x0000_t75" style="width:451.30pt;height:315.54pt;mso-wrap-distance-left:0.00pt;mso-wrap-distance-top:0.00pt;mso-wrap-distance-right:0.00pt;mso-wrap-distance-bottom:0.00pt;z-index:1;" stroked="false">
+                <v:imagedata r:id="rId24" o:title=""/>
+                <o:lock v:ext="edit" rotation="t"/>
+              </v:shape>
+            </w:pict>
+          </mc:Fallback>
+        </mc:AlternateContent>
+      </w:r>
       <w:r/>
       <w:r/>
+    </w:p>
+    <w:p>
+      <w:pPr>
+        <w:pBdr/>
+        <w:spacing/>
+        <w:ind/>
+        <w:rPr>
+          <w:highlight w:val="none"/>
+        </w:rPr>
+      </w:pPr>
+      <w:r>
+        <w:rPr>
+          <w:highlight w:val="none"/>
+        </w:rPr>
+        <w:tab/>
+      </w:r>
+      <w:r>
+        <mc:AlternateContent>
+          <mc:Choice Requires="wpg">
+            <w:drawing>
+              <wp:inline xmlns:wp="http://schemas.openxmlformats.org/drawingml/2006/wordprocessingDrawing" distT="0" distB="0" distL="0" distR="0">
+                <wp:extent cx="5143500" cy="1533525"/>
+                <wp:effectExtent l="0" t="0" r="0" b="0"/>
+                <wp:docPr id="16" name=""/>
+                <wp:cNvGraphicFramePr>
+                  <a:graphicFrameLocks xmlns:a="http://schemas.openxmlformats.org/drawingml/2006/main" noChangeAspect="1"/>
+                </wp:cNvGraphicFramePr>
+                <a:graphic xmlns:a="http://schemas.openxmlformats.org/drawingml/2006/main">
+                  <a:graphicData uri="http://schemas.openxmlformats.org/drawingml/2006/picture">
+                    <pic:pic xmlns:pic="http://schemas.openxmlformats.org/drawingml/2006/picture">
+                      <pic:nvPicPr>
+                        <pic:cNvPr id="1872926612" name=""/>
+                        <pic:cNvPicPr>
+                          <a:picLocks noChangeAspect="1"/>
+                        </pic:cNvPicPr>
+                        <pic:nvPr/>
+                      </pic:nvPicPr>
+                      <pic:blipFill>
+                        <a:blip r:embed="rId25"/>
+                        <a:stretch/>
+                      </pic:blipFill>
+                      <pic:spPr bwMode="auto">
+                        <a:xfrm>
+                          <a:off x="0" y="0"/>
+                          <a:ext cx="5143500" cy="1533524"/>
+                        </a:xfrm>
+                        <a:prstGeom prst="rect">
+                          <a:avLst/>
+                        </a:prstGeom>
+                      </pic:spPr>
+                    </pic:pic>
+                  </a:graphicData>
+                </a:graphic>
+              </wp:inline>
+            </w:drawing>
+          </mc:Choice>
+          <mc:Fallback>
+            <w:pict>
+              <v:shapetype id="_x0000_t75" coordsize="21600,21600" o:spt="75" o:preferrelative="t" path="m@4@5l@4@11@9@11@9@5xe" filled="f" stroked="f">
+                <v:stroke joinstyle="miter"/>
+                <v:formulas>
+                  <v:f eqn="if lineDrawn pixelLineWidth 0"/>
+                  <v:f eqn="sum @0 1 0"/>
+                  <v:f eqn="sum 0 0 @1"/>
+                  <v:f eqn="prod @2 1 2"/>
+                  <v:f eqn="prod @3 21600 pixelWidth"/>
+                  <v:f eqn="prod @3 21600 pixelHeight"/>
+                  <v:f eqn="sum @0 0 1"/>
+                  <v:f eqn="prod @6 1 2"/>
+                  <v:f eqn="prod @7 21600 pixelWidth"/>
+                  <v:f eqn="sum @8 21600 0"/>
+                  <v:f eqn="prod @7 21600 pixelHeight"/>
+                  <v:f eqn="sum @10 21600 0"/>
+                </v:formulas>
+                <v:path o:extrusionok="f" gradientshapeok="t" o:connecttype="rect"/>
+                <o:lock v:ext="edit" aspectratio="t"/>
+              </v:shapetype>
+              <v:shape id="_x0000_i15" o:spid="_x0000_s15" type="#_x0000_t75" style="width:405.00pt;height:120.75pt;mso-wrap-distance-left:0.00pt;mso-wrap-distance-top:0.00pt;mso-wrap-distance-right:0.00pt;mso-wrap-distance-bottom:0.00pt;z-index:1;" stroked="false">
+                <v:imagedata r:id="rId25" o:title=""/>
+                <o:lock v:ext="edit" rotation="t"/>
+              </v:shape>
+            </w:pict>
+          </mc:Fallback>
+        </mc:AlternateContent>
+      </w:r>
+      <w:r>
+        <w:rPr>
+          <w:highlight w:val="none"/>
+        </w:rPr>
+      </w:r>
+      <w:r/>
+      <w:r/>
+      <w:r>
+        <w:br/>
+      </w:r>
+      <w:r>
+        <w:rPr>
+          <w:highlight w:val="none"/>
+        </w:rPr>
+      </w:r>
+      <w:r>
+        <w:rPr>
+          <w:highlight w:val="none"/>
+        </w:rPr>
+      </w:r>
+    </w:p>
+    <w:p>
+      <w:pPr>
+        <w:pBdr/>
+        <w:spacing/>
+        <w:ind w:firstLine="708"/>
+        <w:rPr/>
+      </w:pPr>
+      <w:r>
+        <w:rPr>
+          <w:highlight w:val="none"/>
+        </w:rPr>
+      </w:r>
+      <w:r>
+        <mc:AlternateContent>
+          <mc:Choice Requires="wpg">
+            <w:drawing>
+              <wp:inline xmlns:wp="http://schemas.openxmlformats.org/drawingml/2006/wordprocessingDrawing" distT="0" distB="0" distL="0" distR="0">
+                <wp:extent cx="4248150" cy="1000125"/>
+                <wp:effectExtent l="0" t="0" r="0" b="0"/>
+                <wp:docPr id="17" name=""/>
+                <wp:cNvGraphicFramePr>
+                  <a:graphicFrameLocks xmlns:a="http://schemas.openxmlformats.org/drawingml/2006/main" noChangeAspect="1"/>
+                </wp:cNvGraphicFramePr>
+                <a:graphic xmlns:a="http://schemas.openxmlformats.org/drawingml/2006/main">
+                  <a:graphicData uri="http://schemas.openxmlformats.org/drawingml/2006/picture">
+                    <pic:pic xmlns:pic="http://schemas.openxmlformats.org/drawingml/2006/picture">
+                      <pic:nvPicPr>
+                        <pic:cNvPr id="732099883" name=""/>
+                        <pic:cNvPicPr>
+                          <a:picLocks noChangeAspect="1"/>
+                        </pic:cNvPicPr>
+                        <pic:nvPr/>
+                      </pic:nvPicPr>
+                      <pic:blipFill>
+                        <a:blip r:embed="rId26"/>
+                        <a:stretch/>
+                      </pic:blipFill>
+                      <pic:spPr bwMode="auto">
+                        <a:xfrm rot="0" flipH="0" flipV="0">
+                          <a:off x="0" y="0"/>
+                          <a:ext cx="4248149" cy="1000125"/>
+                        </a:xfrm>
+                        <a:prstGeom prst="rect">
+                          <a:avLst/>
+                        </a:prstGeom>
+                      </pic:spPr>
+                    </pic:pic>
+                  </a:graphicData>
+                </a:graphic>
+              </wp:inline>
+            </w:drawing>
+          </mc:Choice>
+          <mc:Fallback>
+            <w:pict>
+              <v:shapetype id="_x0000_t75" coordsize="21600,21600" o:spt="75" o:preferrelative="t" path="m@4@5l@4@11@9@11@9@5xe" filled="f" stroked="f">
+                <v:stroke joinstyle="miter"/>
+                <v:formulas>
+                  <v:f eqn="if lineDrawn pixelLineWidth 0"/>
+                  <v:f eqn="sum @0 1 0"/>
+                  <v:f eqn="sum 0 0 @1"/>
+                  <v:f eqn="prod @2 1 2"/>
+                  <v:f eqn="prod @3 21600 pixelWidth"/>
+                  <v:f eqn="prod @3 21600 pixelHeight"/>
+                  <v:f eqn="sum @0 0 1"/>
+                  <v:f eqn="prod @6 1 2"/>
+                  <v:f eqn="prod @7 21600 pixelWidth"/>
+                  <v:f eqn="sum @8 21600 0"/>
+                  <v:f eqn="prod @7 21600 pixelHeight"/>
+                  <v:f eqn="sum @10 21600 0"/>
+                </v:formulas>
+                <v:path o:extrusionok="f" gradientshapeok="t" o:connecttype="rect"/>
+                <o:lock v:ext="edit" aspectratio="t"/>
+              </v:shapetype>
+              <v:shape id="_x0000_i16" o:spid="_x0000_s16" type="#_x0000_t75" style="width:334.50pt;height:78.75pt;mso-wrap-distance-left:0.00pt;mso-wrap-distance-top:0.00pt;mso-wrap-distance-right:0.00pt;mso-wrap-distance-bottom:0.00pt;rotation:0;z-index:1;" stroked="false">
+                <v:imagedata r:id="rId26" o:title=""/>
+                <o:lock v:ext="edit" rotation="t"/>
+              </v:shape>
+            </w:pict>
+          </mc:Fallback>
+        </mc:AlternateContent>
+      </w:r>
+      <w:r/>
+      <w:r>
+        <w:rPr>
+          <w:highlight w:val="none"/>
+        </w:rPr>
+      </w:r>
+      <w:r>
+        <w:rPr>
+          <w:highlight w:val="none"/>
+        </w:rPr>
+      </w:r>
     </w:p>
     <w:p>
       <w:pPr>
@@ -454,8 +1876,173 @@
       </w:r>
       <w:r>
         <w:t xml:space="preserve">.</w:t>
+        <w:br/>
+      </w:r>
+      <w:r>
+        <mc:AlternateContent>
+          <mc:Choice Requires="wpg">
+            <w:drawing>
+              <wp:inline xmlns:wp="http://schemas.openxmlformats.org/drawingml/2006/wordprocessingDrawing" distT="0" distB="0" distL="0" distR="0">
+                <wp:extent cx="5731510" cy="1664977"/>
+                <wp:effectExtent l="0" t="0" r="0" b="0"/>
+                <wp:docPr id="18" name=""/>
+                <wp:cNvGraphicFramePr>
+                  <a:graphicFrameLocks xmlns:a="http://schemas.openxmlformats.org/drawingml/2006/main" noChangeAspect="1"/>
+                </wp:cNvGraphicFramePr>
+                <a:graphic xmlns:a="http://schemas.openxmlformats.org/drawingml/2006/main">
+                  <a:graphicData uri="http://schemas.openxmlformats.org/drawingml/2006/picture">
+                    <pic:pic xmlns:pic="http://schemas.openxmlformats.org/drawingml/2006/picture">
+                      <pic:nvPicPr>
+                        <pic:cNvPr id="1805095113" name=""/>
+                        <pic:cNvPicPr>
+                          <a:picLocks noChangeAspect="1"/>
+                        </pic:cNvPicPr>
+                        <pic:nvPr/>
+                      </pic:nvPicPr>
+                      <pic:blipFill>
+                        <a:blip r:embed="rId27"/>
+                        <a:stretch/>
+                      </pic:blipFill>
+                      <pic:spPr bwMode="auto">
+                        <a:xfrm>
+                          <a:off x="0" y="0"/>
+                          <a:ext cx="5731509" cy="1664976"/>
+                        </a:xfrm>
+                        <a:prstGeom prst="rect">
+                          <a:avLst/>
+                        </a:prstGeom>
+                      </pic:spPr>
+                    </pic:pic>
+                  </a:graphicData>
+                </a:graphic>
+              </wp:inline>
+            </w:drawing>
+          </mc:Choice>
+          <mc:Fallback>
+            <w:pict>
+              <v:shapetype id="_x0000_t75" coordsize="21600,21600" o:spt="75" o:preferrelative="t" path="m@4@5l@4@11@9@11@9@5xe" filled="f" stroked="f">
+                <v:stroke joinstyle="miter"/>
+                <v:formulas>
+                  <v:f eqn="if lineDrawn pixelLineWidth 0"/>
+                  <v:f eqn="sum @0 1 0"/>
+                  <v:f eqn="sum 0 0 @1"/>
+                  <v:f eqn="prod @2 1 2"/>
+                  <v:f eqn="prod @3 21600 pixelWidth"/>
+                  <v:f eqn="prod @3 21600 pixelHeight"/>
+                  <v:f eqn="sum @0 0 1"/>
+                  <v:f eqn="prod @6 1 2"/>
+                  <v:f eqn="prod @7 21600 pixelWidth"/>
+                  <v:f eqn="sum @8 21600 0"/>
+                  <v:f eqn="prod @7 21600 pixelHeight"/>
+                  <v:f eqn="sum @10 21600 0"/>
+                </v:formulas>
+                <v:path o:extrusionok="f" gradientshapeok="t" o:connecttype="rect"/>
+                <o:lock v:ext="edit" aspectratio="t"/>
+              </v:shapetype>
+              <v:shape id="_x0000_i17" o:spid="_x0000_s17" type="#_x0000_t75" style="width:451.30pt;height:131.10pt;mso-wrap-distance-left:0.00pt;mso-wrap-distance-top:0.00pt;mso-wrap-distance-right:0.00pt;mso-wrap-distance-bottom:0.00pt;z-index:1;" stroked="false">
+                <v:imagedata r:id="rId27" o:title=""/>
+                <o:lock v:ext="edit" rotation="t"/>
+              </v:shape>
+            </w:pict>
+          </mc:Fallback>
+        </mc:AlternateContent>
       </w:r>
       <w:r/>
+      <w:r/>
+    </w:p>
+    <w:p>
+      <w:pPr>
+        <w:pBdr/>
+        <w:spacing/>
+        <w:ind w:firstLine="708"/>
+        <w:rPr>
+          <w:highlight w:val="none"/>
+        </w:rPr>
+      </w:pPr>
+      <w:r>
+        <w:rPr>
+          <w:highlight w:val="none"/>
+        </w:rPr>
+      </w:r>
+      <w:r>
+        <mc:AlternateContent>
+          <mc:Choice Requires="wpg">
+            <w:drawing>
+              <wp:inline xmlns:wp="http://schemas.openxmlformats.org/drawingml/2006/wordprocessingDrawing" distT="0" distB="0" distL="0" distR="0">
+                <wp:extent cx="4657725" cy="990600"/>
+                <wp:effectExtent l="0" t="0" r="0" b="0"/>
+                <wp:docPr id="19" name=""/>
+                <wp:cNvGraphicFramePr>
+                  <a:graphicFrameLocks xmlns:a="http://schemas.openxmlformats.org/drawingml/2006/main" noChangeAspect="1"/>
+                </wp:cNvGraphicFramePr>
+                <a:graphic xmlns:a="http://schemas.openxmlformats.org/drawingml/2006/main">
+                  <a:graphicData uri="http://schemas.openxmlformats.org/drawingml/2006/picture">
+                    <pic:pic xmlns:pic="http://schemas.openxmlformats.org/drawingml/2006/picture">
+                      <pic:nvPicPr>
+                        <pic:cNvPr id="602680037" name=""/>
+                        <pic:cNvPicPr>
+                          <a:picLocks noChangeAspect="1"/>
+                        </pic:cNvPicPr>
+                        <pic:nvPr/>
+                      </pic:nvPicPr>
+                      <pic:blipFill>
+                        <a:blip r:embed="rId28"/>
+                        <a:stretch/>
+                      </pic:blipFill>
+                      <pic:spPr bwMode="auto">
+                        <a:xfrm>
+                          <a:off x="0" y="0"/>
+                          <a:ext cx="4657725" cy="990599"/>
+                        </a:xfrm>
+                        <a:prstGeom prst="rect">
+                          <a:avLst/>
+                        </a:prstGeom>
+                      </pic:spPr>
+                    </pic:pic>
+                  </a:graphicData>
+                </a:graphic>
+              </wp:inline>
+            </w:drawing>
+          </mc:Choice>
+          <mc:Fallback>
+            <w:pict>
+              <v:shapetype id="_x0000_t75" coordsize="21600,21600" o:spt="75" o:preferrelative="t" path="m@4@5l@4@11@9@11@9@5xe" filled="f" stroked="f">
+                <v:stroke joinstyle="miter"/>
+                <v:formulas>
+                  <v:f eqn="if lineDrawn pixelLineWidth 0"/>
+                  <v:f eqn="sum @0 1 0"/>
+                  <v:f eqn="sum 0 0 @1"/>
+                  <v:f eqn="prod @2 1 2"/>
+                  <v:f eqn="prod @3 21600 pixelWidth"/>
+                  <v:f eqn="prod @3 21600 pixelHeight"/>
+                  <v:f eqn="sum @0 0 1"/>
+                  <v:f eqn="prod @6 1 2"/>
+                  <v:f eqn="prod @7 21600 pixelWidth"/>
+                  <v:f eqn="sum @8 21600 0"/>
+                  <v:f eqn="prod @7 21600 pixelHeight"/>
+                  <v:f eqn="sum @10 21600 0"/>
+                </v:formulas>
+                <v:path o:extrusionok="f" gradientshapeok="t" o:connecttype="rect"/>
+                <o:lock v:ext="edit" aspectratio="t"/>
+              </v:shapetype>
+              <v:shape id="_x0000_i18" o:spid="_x0000_s18" type="#_x0000_t75" style="width:366.75pt;height:78.00pt;mso-wrap-distance-left:0.00pt;mso-wrap-distance-top:0.00pt;mso-wrap-distance-right:0.00pt;mso-wrap-distance-bottom:0.00pt;z-index:1;" stroked="false">
+                <v:imagedata r:id="rId28" o:title=""/>
+                <o:lock v:ext="edit" rotation="t"/>
+              </v:shape>
+            </w:pict>
+          </mc:Fallback>
+        </mc:AlternateContent>
+      </w:r>
+      <w:r>
+        <w:rPr>
+          <w:highlight w:val="none"/>
+        </w:rPr>
+      </w:r>
+      <w:r>
+        <w:rPr>
+          <w:highlight w:val="none"/>
+        </w:rPr>
+      </w:r>
     </w:p>
     <w:p>
       <w:pPr>
@@ -524,9 +2111,316 @@
         <w:rPr/>
       </w:pPr>
       <w:r/>
+      <w:r>
+        <mc:AlternateContent>
+          <mc:Choice Requires="wpg">
+            <w:drawing>
+              <wp:inline xmlns:wp="http://schemas.openxmlformats.org/drawingml/2006/wordprocessingDrawing" distT="0" distB="0" distL="0" distR="0">
+                <wp:extent cx="5731510" cy="2243776"/>
+                <wp:effectExtent l="0" t="0" r="0" b="0"/>
+                <wp:docPr id="20" name=""/>
+                <wp:cNvGraphicFramePr>
+                  <a:graphicFrameLocks xmlns:a="http://schemas.openxmlformats.org/drawingml/2006/main" noChangeAspect="1"/>
+                </wp:cNvGraphicFramePr>
+                <a:graphic xmlns:a="http://schemas.openxmlformats.org/drawingml/2006/main">
+                  <a:graphicData uri="http://schemas.openxmlformats.org/drawingml/2006/picture">
+                    <pic:pic xmlns:pic="http://schemas.openxmlformats.org/drawingml/2006/picture">
+                      <pic:nvPicPr>
+                        <pic:cNvPr id="1123804599" name=""/>
+                        <pic:cNvPicPr>
+                          <a:picLocks noChangeAspect="1"/>
+                        </pic:cNvPicPr>
+                        <pic:nvPr/>
+                      </pic:nvPicPr>
+                      <pic:blipFill>
+                        <a:blip r:embed="rId29"/>
+                        <a:stretch/>
+                      </pic:blipFill>
+                      <pic:spPr bwMode="auto">
+                        <a:xfrm>
+                          <a:off x="0" y="0"/>
+                          <a:ext cx="5731509" cy="2243775"/>
+                        </a:xfrm>
+                        <a:prstGeom prst="rect">
+                          <a:avLst/>
+                        </a:prstGeom>
+                      </pic:spPr>
+                    </pic:pic>
+                  </a:graphicData>
+                </a:graphic>
+              </wp:inline>
+            </w:drawing>
+          </mc:Choice>
+          <mc:Fallback>
+            <w:pict>
+              <v:shapetype id="_x0000_t75" coordsize="21600,21600" o:spt="75" o:preferrelative="t" path="m@4@5l@4@11@9@11@9@5xe" filled="f" stroked="f">
+                <v:stroke joinstyle="miter"/>
+                <v:formulas>
+                  <v:f eqn="if lineDrawn pixelLineWidth 0"/>
+                  <v:f eqn="sum @0 1 0"/>
+                  <v:f eqn="sum 0 0 @1"/>
+                  <v:f eqn="prod @2 1 2"/>
+                  <v:f eqn="prod @3 21600 pixelWidth"/>
+                  <v:f eqn="prod @3 21600 pixelHeight"/>
+                  <v:f eqn="sum @0 0 1"/>
+                  <v:f eqn="prod @6 1 2"/>
+                  <v:f eqn="prod @7 21600 pixelWidth"/>
+                  <v:f eqn="sum @8 21600 0"/>
+                  <v:f eqn="prod @7 21600 pixelHeight"/>
+                  <v:f eqn="sum @10 21600 0"/>
+                </v:formulas>
+                <v:path o:extrusionok="f" gradientshapeok="t" o:connecttype="rect"/>
+                <o:lock v:ext="edit" aspectratio="t"/>
+              </v:shapetype>
+              <v:shape id="_x0000_i19" o:spid="_x0000_s19" type="#_x0000_t75" style="width:451.30pt;height:176.68pt;mso-wrap-distance-left:0.00pt;mso-wrap-distance-top:0.00pt;mso-wrap-distance-right:0.00pt;mso-wrap-distance-bottom:0.00pt;z-index:1;" stroked="false">
+                <v:imagedata r:id="rId29" o:title=""/>
+                <o:lock v:ext="edit" rotation="t"/>
+              </v:shape>
+            </w:pict>
+          </mc:Fallback>
+        </mc:AlternateContent>
+        <w:br/>
+      </w:r>
+      <w:r>
+        <mc:AlternateContent>
+          <mc:Choice Requires="wpg">
+            <w:drawing>
+              <wp:inline xmlns:wp="http://schemas.openxmlformats.org/drawingml/2006/wordprocessingDrawing" distT="0" distB="0" distL="0" distR="0">
+                <wp:extent cx="1485900" cy="542925"/>
+                <wp:effectExtent l="0" t="0" r="0" b="0"/>
+                <wp:docPr id="21" name=""/>
+                <wp:cNvGraphicFramePr>
+                  <a:graphicFrameLocks xmlns:a="http://schemas.openxmlformats.org/drawingml/2006/main" noChangeAspect="1"/>
+                </wp:cNvGraphicFramePr>
+                <a:graphic xmlns:a="http://schemas.openxmlformats.org/drawingml/2006/main">
+                  <a:graphicData uri="http://schemas.openxmlformats.org/drawingml/2006/picture">
+                    <pic:pic xmlns:pic="http://schemas.openxmlformats.org/drawingml/2006/picture">
+                      <pic:nvPicPr>
+                        <pic:cNvPr id="1018469284" name=""/>
+                        <pic:cNvPicPr>
+                          <a:picLocks noChangeAspect="1"/>
+                        </pic:cNvPicPr>
+                        <pic:nvPr/>
+                      </pic:nvPicPr>
+                      <pic:blipFill>
+                        <a:blip r:embed="rId30"/>
+                        <a:stretch/>
+                      </pic:blipFill>
+                      <pic:spPr bwMode="auto">
+                        <a:xfrm>
+                          <a:off x="0" y="0"/>
+                          <a:ext cx="1485900" cy="542925"/>
+                        </a:xfrm>
+                        <a:prstGeom prst="rect">
+                          <a:avLst/>
+                        </a:prstGeom>
+                      </pic:spPr>
+                    </pic:pic>
+                  </a:graphicData>
+                </a:graphic>
+              </wp:inline>
+            </w:drawing>
+          </mc:Choice>
+          <mc:Fallback>
+            <w:pict>
+              <v:shapetype id="_x0000_t75" coordsize="21600,21600" o:spt="75" o:preferrelative="t" path="m@4@5l@4@11@9@11@9@5xe" filled="f" stroked="f">
+                <v:stroke joinstyle="miter"/>
+                <v:formulas>
+                  <v:f eqn="if lineDrawn pixelLineWidth 0"/>
+                  <v:f eqn="sum @0 1 0"/>
+                  <v:f eqn="sum 0 0 @1"/>
+                  <v:f eqn="prod @2 1 2"/>
+                  <v:f eqn="prod @3 21600 pixelWidth"/>
+                  <v:f eqn="prod @3 21600 pixelHeight"/>
+                  <v:f eqn="sum @0 0 1"/>
+                  <v:f eqn="prod @6 1 2"/>
+                  <v:f eqn="prod @7 21600 pixelWidth"/>
+                  <v:f eqn="sum @8 21600 0"/>
+                  <v:f eqn="prod @7 21600 pixelHeight"/>
+                  <v:f eqn="sum @10 21600 0"/>
+                </v:formulas>
+                <v:path o:extrusionok="f" gradientshapeok="t" o:connecttype="rect"/>
+                <o:lock v:ext="edit" aspectratio="t"/>
+              </v:shapetype>
+              <v:shape id="_x0000_i20" o:spid="_x0000_s20" type="#_x0000_t75" style="width:117.00pt;height:42.75pt;mso-wrap-distance-left:0.00pt;mso-wrap-distance-top:0.00pt;mso-wrap-distance-right:0.00pt;mso-wrap-distance-bottom:0.00pt;z-index:1;" stroked="false">
+                <v:imagedata r:id="rId30" o:title=""/>
+                <o:lock v:ext="edit" rotation="t"/>
+              </v:shape>
+            </w:pict>
+          </mc:Fallback>
+        </mc:AlternateContent>
+      </w:r>
+      <w:r>
+        <w:rPr>
+          <w:color w:val="4472c4" w:themeColor="accent1"/>
+          <w:lang w:val="en-GB"/>
+        </w:rPr>
+        <w:t xml:space="preserve"> Geheim is weg in dubug mode</w:t>
+        <w:br/>
+        <w:br/>
+      </w:r>
+      <w:r>
+        <mc:AlternateContent>
+          <mc:Choice Requires="wpg">
+            <w:drawing>
+              <wp:inline xmlns:wp="http://schemas.openxmlformats.org/drawingml/2006/wordprocessingDrawing" distT="0" distB="0" distL="0" distR="0">
+                <wp:extent cx="5731510" cy="2496857"/>
+                <wp:effectExtent l="0" t="0" r="0" b="0"/>
+                <wp:docPr id="22" name=""/>
+                <wp:cNvGraphicFramePr>
+                  <a:graphicFrameLocks xmlns:a="http://schemas.openxmlformats.org/drawingml/2006/main" noChangeAspect="1"/>
+                </wp:cNvGraphicFramePr>
+                <a:graphic xmlns:a="http://schemas.openxmlformats.org/drawingml/2006/main">
+                  <a:graphicData uri="http://schemas.openxmlformats.org/drawingml/2006/picture">
+                    <pic:pic xmlns:pic="http://schemas.openxmlformats.org/drawingml/2006/picture">
+                      <pic:nvPicPr>
+                        <pic:cNvPr id="650795984" name=""/>
+                        <pic:cNvPicPr>
+                          <a:picLocks noChangeAspect="1"/>
+                        </pic:cNvPicPr>
+                        <pic:nvPr/>
+                      </pic:nvPicPr>
+                      <pic:blipFill>
+                        <a:blip r:embed="rId31"/>
+                        <a:stretch/>
+                      </pic:blipFill>
+                      <pic:spPr bwMode="auto">
+                        <a:xfrm>
+                          <a:off x="0" y="0"/>
+                          <a:ext cx="5731509" cy="2496856"/>
+                        </a:xfrm>
+                        <a:prstGeom prst="rect">
+                          <a:avLst/>
+                        </a:prstGeom>
+                      </pic:spPr>
+                    </pic:pic>
+                  </a:graphicData>
+                </a:graphic>
+              </wp:inline>
+            </w:drawing>
+          </mc:Choice>
+          <mc:Fallback>
+            <w:pict>
+              <v:shapetype id="_x0000_t75" coordsize="21600,21600" o:spt="75" o:preferrelative="t" path="m@4@5l@4@11@9@11@9@5xe" filled="f" stroked="f">
+                <v:stroke joinstyle="miter"/>
+                <v:formulas>
+                  <v:f eqn="if lineDrawn pixelLineWidth 0"/>
+                  <v:f eqn="sum @0 1 0"/>
+                  <v:f eqn="sum 0 0 @1"/>
+                  <v:f eqn="prod @2 1 2"/>
+                  <v:f eqn="prod @3 21600 pixelWidth"/>
+                  <v:f eqn="prod @3 21600 pixelHeight"/>
+                  <v:f eqn="sum @0 0 1"/>
+                  <v:f eqn="prod @6 1 2"/>
+                  <v:f eqn="prod @7 21600 pixelWidth"/>
+                  <v:f eqn="sum @8 21600 0"/>
+                  <v:f eqn="prod @7 21600 pixelHeight"/>
+                  <v:f eqn="sum @10 21600 0"/>
+                </v:formulas>
+                <v:path o:extrusionok="f" gradientshapeok="t" o:connecttype="rect"/>
+                <o:lock v:ext="edit" aspectratio="t"/>
+              </v:shapetype>
+              <v:shape id="_x0000_i21" o:spid="_x0000_s21" type="#_x0000_t75" style="width:451.30pt;height:196.60pt;mso-wrap-distance-left:0.00pt;mso-wrap-distance-top:0.00pt;mso-wrap-distance-right:0.00pt;mso-wrap-distance-bottom:0.00pt;z-index:1;" stroked="false">
+                <v:imagedata r:id="rId31" o:title=""/>
+                <o:lock v:ext="edit" rotation="t"/>
+              </v:shape>
+            </w:pict>
+          </mc:Fallback>
+        </mc:AlternateContent>
+        <w:br/>
+      </w:r>
+      <w:r>
+        <w:rPr>
+          <w:color w:val="4472c4" w:themeColor="accent1"/>
+          <w:lang w:val="en-GB"/>
+        </w:rPr>
+        <w:t xml:space="preserve">Gehiem staat er nog in Release mode</w:t>
+      </w:r>
+      <w:r>
+        <w:rPr>
+          <w:lang w:val="en-GB"/>
+        </w:rPr>
+        <w:br/>
+      </w:r>
+      <w:r>
+        <mc:AlternateContent>
+          <mc:Choice Requires="wpg">
+            <w:drawing>
+              <wp:inline xmlns:wp="http://schemas.openxmlformats.org/drawingml/2006/wordprocessingDrawing" distT="0" distB="0" distL="0" distR="0">
+                <wp:extent cx="5731510" cy="2543932"/>
+                <wp:effectExtent l="0" t="0" r="0" b="0"/>
+                <wp:docPr id="23" name=""/>
+                <wp:cNvGraphicFramePr>
+                  <a:graphicFrameLocks xmlns:a="http://schemas.openxmlformats.org/drawingml/2006/main" noChangeAspect="1"/>
+                </wp:cNvGraphicFramePr>
+                <a:graphic xmlns:a="http://schemas.openxmlformats.org/drawingml/2006/main">
+                  <a:graphicData uri="http://schemas.openxmlformats.org/drawingml/2006/picture">
+                    <pic:pic xmlns:pic="http://schemas.openxmlformats.org/drawingml/2006/picture">
+                      <pic:nvPicPr>
+                        <pic:cNvPr id="418895075" name=""/>
+                        <pic:cNvPicPr>
+                          <a:picLocks noChangeAspect="1"/>
+                        </pic:cNvPicPr>
+                        <pic:nvPr/>
+                      </pic:nvPicPr>
+                      <pic:blipFill>
+                        <a:blip r:embed="rId32"/>
+                        <a:stretch/>
+                      </pic:blipFill>
+                      <pic:spPr bwMode="auto">
+                        <a:xfrm>
+                          <a:off x="0" y="0"/>
+                          <a:ext cx="5731509" cy="2543932"/>
+                        </a:xfrm>
+                        <a:prstGeom prst="rect">
+                          <a:avLst/>
+                        </a:prstGeom>
+                      </pic:spPr>
+                    </pic:pic>
+                  </a:graphicData>
+                </a:graphic>
+              </wp:inline>
+            </w:drawing>
+          </mc:Choice>
+          <mc:Fallback>
+            <w:pict>
+              <v:shapetype id="_x0000_t75" coordsize="21600,21600" o:spt="75" o:preferrelative="t" path="m@4@5l@4@11@9@11@9@5xe" filled="f" stroked="f">
+                <v:stroke joinstyle="miter"/>
+                <v:formulas>
+                  <v:f eqn="if lineDrawn pixelLineWidth 0"/>
+                  <v:f eqn="sum @0 1 0"/>
+                  <v:f eqn="sum 0 0 @1"/>
+                  <v:f eqn="prod @2 1 2"/>
+                  <v:f eqn="prod @3 21600 pixelWidth"/>
+                  <v:f eqn="prod @3 21600 pixelHeight"/>
+                  <v:f eqn="sum @0 0 1"/>
+                  <v:f eqn="prod @6 1 2"/>
+                  <v:f eqn="prod @7 21600 pixelWidth"/>
+                  <v:f eqn="sum @8 21600 0"/>
+                  <v:f eqn="prod @7 21600 pixelHeight"/>
+                  <v:f eqn="sum @10 21600 0"/>
+                </v:formulas>
+                <v:path o:extrusionok="f" gradientshapeok="t" o:connecttype="rect"/>
+                <o:lock v:ext="edit" aspectratio="t"/>
+              </v:shapetype>
+              <v:shape id="_x0000_i22" o:spid="_x0000_s22" type="#_x0000_t75" style="width:451.30pt;height:200.31pt;mso-wrap-distance-left:0.00pt;mso-wrap-distance-top:0.00pt;mso-wrap-distance-right:0.00pt;mso-wrap-distance-bottom:0.00pt;z-index:1;" stroked="false">
+                <v:imagedata r:id="rId32" o:title=""/>
+                <o:lock v:ext="edit" rotation="t"/>
+              </v:shape>
+            </w:pict>
+          </mc:Fallback>
+        </mc:AlternateContent>
+      </w:r>
+      <w:r>
+        <w:rPr>
+          <w:lang w:val="en-GB"/>
+        </w:rPr>
+      </w:r>
+      <w:r/>
       <w:r/>
     </w:p>
     <w:sectPr>
+      <w:headerReference w:type="default" r:id="rId9"/>
       <w:footnotePr/>
       <w:endnotePr/>
       <w:type w:val="nextPage"/>
@@ -608,6 +2502,51 @@
 </w:footnotes>
 </file>
 
+<file path=word/header1.xml><?xml version="1.0" encoding="utf-8"?>
+<w:hdr xmlns:wpc="http://schemas.microsoft.com/office/word/2010/wordprocessingCanvas" xmlns:mc="http://schemas.openxmlformats.org/markup-compatibility/2006" xmlns:o="urn:schemas-microsoft-com:office:office" xmlns:r="http://schemas.openxmlformats.org/officeDocument/2006/relationships" xmlns:m="http://schemas.openxmlformats.org/officeDocument/2006/math" xmlns:v="urn:schemas-microsoft-com:vml" xmlns:wp14="http://schemas.microsoft.com/office/word/2010/wordprocessingDrawing" xmlns:wp="http://schemas.openxmlformats.org/drawingml/2006/wordprocessingDrawing" xmlns:w10="urn:schemas-microsoft-com:office:word" xmlns:w="http://schemas.openxmlformats.org/wordprocessingml/2006/main" xmlns:w14="http://schemas.microsoft.com/office/word/2010/wordml" xmlns:w15="http://schemas.microsoft.com/office/word/2012/wordml" xmlns:wpg="http://schemas.microsoft.com/office/word/2010/wordprocessingGroup" xmlns:wpi="http://schemas.microsoft.com/office/word/2010/wordprocessingInk" xmlns:wne="http://schemas.microsoft.com/office/word/2006/wordml" xmlns:a="http://schemas.openxmlformats.org/drawingml/2006/main" xmlns:wps="http://schemas.microsoft.com/office/word/2010/wordprocessingShape" mc:Ignorable="w14 w15 wp14">
+  <w:p>
+    <w:pPr>
+      <w:pStyle w:val="42"/>
+      <w:pBdr/>
+      <w:spacing/>
+      <w:ind/>
+      <w:rPr>
+        <w:highlight w:val="none"/>
+        <w:lang w:val="en-GB"/>
+      </w:rPr>
+    </w:pPr>
+    <w:r>
+      <w:rPr>
+        <w:lang w:val="en-GB"/>
+      </w:rPr>
+      <w:t xml:space="preserve">Author Tom Steenvoorden</w:t>
+    </w:r>
+    <w:r/>
+  </w:p>
+  <w:p>
+    <w:pPr>
+      <w:pStyle w:val="42"/>
+      <w:pBdr/>
+      <w:spacing/>
+      <w:ind/>
+      <w:rPr/>
+    </w:pPr>
+    <w:r>
+      <w:rPr>
+        <w:highlight w:val="none"/>
+        <w:lang w:val="en-GB"/>
+      </w:rPr>
+    </w:r>
+    <w:r>
+      <w:rPr>
+        <w:highlight w:val="none"/>
+        <w:lang w:val="en-GB"/>
+      </w:rPr>
+    </w:r>
+  </w:p>
+</w:hdr>
+</file>
+
 <file path=word/numbering.xml><?xml version="1.0" encoding="utf-8"?>
 <w:numbering xmlns:wpc="http://schemas.microsoft.com/office/word/2010/wordprocessingCanvas" xmlns:mc="http://schemas.openxmlformats.org/markup-compatibility/2006" xmlns:o="urn:schemas-microsoft-com:office:office" xmlns:r="http://schemas.openxmlformats.org/officeDocument/2006/relationships" xmlns:m="http://schemas.openxmlformats.org/officeDocument/2006/math" xmlns:v="urn:schemas-microsoft-com:vml" xmlns:wp14="http://schemas.microsoft.com/office/word/2010/wordprocessingDrawing" xmlns:wp="http://schemas.openxmlformats.org/drawingml/2006/wordprocessingDrawing" xmlns:w10="urn:schemas-microsoft-com:office:word" xmlns:w="http://schemas.openxmlformats.org/wordprocessingml/2006/main" xmlns:w14="http://schemas.microsoft.com/office/word/2010/wordml" xmlns:w15="http://schemas.microsoft.com/office/word/2012/wordml" xmlns:wpg="http://schemas.microsoft.com/office/word/2010/wordprocessingGroup" xmlns:wpi="http://schemas.microsoft.com/office/word/2010/wordprocessingInk" xmlns:wne="http://schemas.microsoft.com/office/word/2006/wordml" xmlns:wps="http://schemas.microsoft.com/office/word/2010/wordprocessingShape" mc:Ignorable="w14 w15 wp14">
   <w:abstractNum w:abstractNumId="0">
@@ -871,6 +2810,136 @@
     </w:lvl>
   </w:abstractNum>
   <w:abstractNum w:abstractNumId="2">
+    <w:lvl w:ilvl="0">
+      <w:isLgl w:val="false"/>
+      <w:lvlJc w:val="left"/>
+      <w:lvlText w:val="%1)"/>
+      <w:numFmt w:val="decimal"/>
+      <w:pPr>
+        <w:pBdr/>
+        <w:spacing/>
+        <w:ind w:hanging="360" w:left="720"/>
+      </w:pPr>
+      <w:rPr>
+        <w:rFonts w:hint="default"/>
+      </w:rPr>
+      <w:start w:val="1"/>
+      <w:suff w:val="tab"/>
+    </w:lvl>
+    <w:lvl w:ilvl="1">
+      <w:isLgl w:val="false"/>
+      <w:lvlJc w:val="left"/>
+      <w:lvlText w:val="%2."/>
+      <w:numFmt w:val="lowerLetter"/>
+      <w:pPr>
+        <w:pBdr/>
+        <w:spacing/>
+        <w:ind w:hanging="360" w:left="1440"/>
+      </w:pPr>
+      <w:rPr/>
+      <w:start w:val="1"/>
+      <w:suff w:val="tab"/>
+    </w:lvl>
+    <w:lvl w:ilvl="2">
+      <w:isLgl w:val="false"/>
+      <w:lvlJc w:val="right"/>
+      <w:lvlText w:val="%3."/>
+      <w:numFmt w:val="lowerRoman"/>
+      <w:pPr>
+        <w:pBdr/>
+        <w:spacing/>
+        <w:ind w:hanging="180" w:left="2160"/>
+      </w:pPr>
+      <w:rPr/>
+      <w:start w:val="1"/>
+      <w:suff w:val="tab"/>
+    </w:lvl>
+    <w:lvl w:ilvl="3">
+      <w:isLgl w:val="false"/>
+      <w:lvlJc w:val="left"/>
+      <w:lvlText w:val="%4."/>
+      <w:numFmt w:val="decimal"/>
+      <w:pPr>
+        <w:pBdr/>
+        <w:spacing/>
+        <w:ind w:hanging="360" w:left="2880"/>
+      </w:pPr>
+      <w:rPr/>
+      <w:start w:val="1"/>
+      <w:suff w:val="tab"/>
+    </w:lvl>
+    <w:lvl w:ilvl="4">
+      <w:isLgl w:val="false"/>
+      <w:lvlJc w:val="left"/>
+      <w:lvlText w:val="%5."/>
+      <w:numFmt w:val="lowerLetter"/>
+      <w:pPr>
+        <w:pBdr/>
+        <w:spacing/>
+        <w:ind w:hanging="360" w:left="3600"/>
+      </w:pPr>
+      <w:rPr/>
+      <w:start w:val="1"/>
+      <w:suff w:val="tab"/>
+    </w:lvl>
+    <w:lvl w:ilvl="5">
+      <w:isLgl w:val="false"/>
+      <w:lvlJc w:val="right"/>
+      <w:lvlText w:val="%6."/>
+      <w:numFmt w:val="lowerRoman"/>
+      <w:pPr>
+        <w:pBdr/>
+        <w:spacing/>
+        <w:ind w:hanging="180" w:left="4320"/>
+      </w:pPr>
+      <w:rPr/>
+      <w:start w:val="1"/>
+      <w:suff w:val="tab"/>
+    </w:lvl>
+    <w:lvl w:ilvl="6">
+      <w:isLgl w:val="false"/>
+      <w:lvlJc w:val="left"/>
+      <w:lvlText w:val="%7."/>
+      <w:numFmt w:val="decimal"/>
+      <w:pPr>
+        <w:pBdr/>
+        <w:spacing/>
+        <w:ind w:hanging="360" w:left="5040"/>
+      </w:pPr>
+      <w:rPr/>
+      <w:start w:val="1"/>
+      <w:suff w:val="tab"/>
+    </w:lvl>
+    <w:lvl w:ilvl="7">
+      <w:isLgl w:val="false"/>
+      <w:lvlJc w:val="left"/>
+      <w:lvlText w:val="%8."/>
+      <w:numFmt w:val="lowerLetter"/>
+      <w:pPr>
+        <w:pBdr/>
+        <w:spacing/>
+        <w:ind w:hanging="360" w:left="5760"/>
+      </w:pPr>
+      <w:rPr/>
+      <w:start w:val="1"/>
+      <w:suff w:val="tab"/>
+    </w:lvl>
+    <w:lvl w:ilvl="8">
+      <w:isLgl w:val="false"/>
+      <w:lvlJc w:val="right"/>
+      <w:lvlText w:val="%9."/>
+      <w:numFmt w:val="lowerRoman"/>
+      <w:pPr>
+        <w:pBdr/>
+        <w:spacing/>
+        <w:ind w:hanging="180" w:left="6480"/>
+      </w:pPr>
+      <w:rPr/>
+      <w:start w:val="1"/>
+      <w:suff w:val="tab"/>
+    </w:lvl>
+  </w:abstractNum>
+  <w:abstractNum w:abstractNumId="3">
     <w:lvl w:ilvl="0">
       <w:isLgl w:val="false"/>
       <w:lvlJc w:val="left"/>
@@ -1008,6 +3077,9 @@
   </w:num>
   <w:num w:numId="3">
     <w:abstractNumId w:val="0"/>
+  </w:num>
+  <w:num w:numId="4">
+    <w:abstractNumId w:val="3"/>
   </w:num>
 </w:numbering>
 </file>

</xml_diff>